<commit_message>
Add cw example and start the cw itself
</commit_message>
<xml_diff>
--- a/tou/cw/coursework.DOCX
+++ b/tou/cw/coursework.DOCX
@@ -506,23 +506,13 @@
                 <w:szCs w:val="28"/>
               </w:rPr>
             </w:pPr>
-            <w:proofErr w:type="spellStart"/>
-            <w:r>
-              <w:rPr>
-                <w:rFonts w:ascii="Times New Roman" w:hAnsi="Times New Roman" w:cs="Times New Roman"/>
-                <w:sz w:val="28"/>
-                <w:szCs w:val="28"/>
-              </w:rPr>
-              <w:t>Амбросовская</w:t>
-            </w:r>
-            <w:proofErr w:type="spellEnd"/>
-            <w:r>
-              <w:rPr>
-                <w:rFonts w:ascii="Times New Roman" w:hAnsi="Times New Roman" w:cs="Times New Roman"/>
-                <w:sz w:val="28"/>
-                <w:szCs w:val="28"/>
-              </w:rPr>
-              <w:t xml:space="preserve"> Е.Б.</w:t>
+            <w:r>
+              <w:rPr>
+                <w:rFonts w:ascii="Times New Roman" w:hAnsi="Times New Roman" w:cs="Times New Roman"/>
+                <w:sz w:val="28"/>
+                <w:szCs w:val="28"/>
+              </w:rPr>
+              <w:t>Амбросовская Е.Б.</w:t>
             </w:r>
           </w:p>
         </w:tc>
@@ -949,52 +939,38 @@
                 <w:szCs w:val="18"/>
               </w:rPr>
             </w:pPr>
-            <w:proofErr w:type="spellStart"/>
-            <w:proofErr w:type="gramStart"/>
             <w:r>
               <w:rPr>
                 <w:rFonts w:ascii="Times New Roman" w:hAnsi="Times New Roman" w:cs="Times New Roman"/>
                 <w:sz w:val="18"/>
                 <w:szCs w:val="18"/>
               </w:rPr>
-              <w:t>средняя,м</w:t>
-            </w:r>
-            <w:proofErr w:type="spellEnd"/>
-            <w:r>
+              <w:t>средняя,м.</w:t>
+            </w:r>
+          </w:p>
+        </w:tc>
+        <w:tc>
+          <w:tcPr>
+            <w:tcW w:w="1129" w:type="dxa"/>
+            <w:vAlign w:val="center"/>
+          </w:tcPr>
+          <w:p>
+            <w:pPr>
+              <w:jc w:val="center"/>
               <w:rPr>
                 <w:rFonts w:ascii="Times New Roman" w:hAnsi="Times New Roman" w:cs="Times New Roman"/>
                 <w:sz w:val="18"/>
                 <w:szCs w:val="18"/>
               </w:rPr>
-              <w:t>.</w:t>
-            </w:r>
-            <w:proofErr w:type="gramEnd"/>
-          </w:p>
-        </w:tc>
-        <w:tc>
-          <w:tcPr>
-            <w:tcW w:w="1129" w:type="dxa"/>
-            <w:vAlign w:val="center"/>
-          </w:tcPr>
-          <w:p>
-            <w:pPr>
-              <w:jc w:val="center"/>
+            </w:pPr>
+            <w:r>
               <w:rPr>
                 <w:rFonts w:ascii="Times New Roman" w:hAnsi="Times New Roman" w:cs="Times New Roman"/>
                 <w:sz w:val="18"/>
                 <w:szCs w:val="18"/>
               </w:rPr>
-            </w:pPr>
-            <w:proofErr w:type="spellStart"/>
-            <w:r>
-              <w:rPr>
-                <w:rFonts w:ascii="Times New Roman" w:hAnsi="Times New Roman" w:cs="Times New Roman"/>
-                <w:sz w:val="18"/>
-                <w:szCs w:val="18"/>
-              </w:rPr>
               <w:t>Коэффици-ент</w:t>
             </w:r>
-            <w:proofErr w:type="spellEnd"/>
           </w:p>
           <w:p>
             <w:pPr>
@@ -1030,41 +1006,13 @@
                 <w:vertAlign w:val="subscript"/>
               </w:rPr>
             </w:pPr>
-            <w:proofErr w:type="spellStart"/>
             <w:r>
               <w:rPr>
                 <w:rFonts w:ascii="Times New Roman" w:hAnsi="Times New Roman" w:cs="Times New Roman"/>
                 <w:sz w:val="18"/>
                 <w:szCs w:val="18"/>
               </w:rPr>
-              <w:t>Коэффици-ент</w:t>
-            </w:r>
-            <w:proofErr w:type="spellEnd"/>
-            <w:r>
-              <w:rPr>
-                <w:rFonts w:ascii="Times New Roman" w:hAnsi="Times New Roman" w:cs="Times New Roman"/>
-                <w:sz w:val="18"/>
-                <w:szCs w:val="18"/>
-              </w:rPr>
-              <w:t xml:space="preserve"> </w:t>
-            </w:r>
-            <w:proofErr w:type="spellStart"/>
-            <w:r>
-              <w:rPr>
-                <w:rFonts w:ascii="Times New Roman" w:hAnsi="Times New Roman" w:cs="Times New Roman"/>
-                <w:sz w:val="18"/>
-                <w:szCs w:val="18"/>
-              </w:rPr>
-              <w:t>сопротивле-ния</w:t>
-            </w:r>
-            <w:proofErr w:type="spellEnd"/>
-            <w:r>
-              <w:rPr>
-                <w:rFonts w:ascii="Times New Roman" w:hAnsi="Times New Roman" w:cs="Times New Roman"/>
-                <w:sz w:val="18"/>
-                <w:szCs w:val="18"/>
-              </w:rPr>
-              <w:t xml:space="preserve"> судна </w:t>
+              <w:t xml:space="preserve">Коэффици-ент сопротивле-ния судна </w:t>
             </w:r>
             <w:r>
               <w:rPr>
@@ -1175,67 +1123,31 @@
                 <w:sz w:val="18"/>
                 <w:szCs w:val="18"/>
               </w:rPr>
-              <w:t xml:space="preserve">Частота вращения ГВ </w:t>
-            </w:r>
-            <w:proofErr w:type="spellStart"/>
-            <w:r>
+              <w:t>Частота вращения ГВ номиналь-ная, об/мин</w:t>
+            </w:r>
+          </w:p>
+        </w:tc>
+        <w:tc>
+          <w:tcPr>
+            <w:tcW w:w="964" w:type="dxa"/>
+            <w:vAlign w:val="center"/>
+          </w:tcPr>
+          <w:p>
+            <w:pPr>
+              <w:jc w:val="center"/>
               <w:rPr>
                 <w:rFonts w:ascii="Times New Roman" w:hAnsi="Times New Roman" w:cs="Times New Roman"/>
                 <w:sz w:val="18"/>
                 <w:szCs w:val="18"/>
               </w:rPr>
-              <w:t>номиналь</w:t>
-            </w:r>
-            <w:proofErr w:type="spellEnd"/>
+            </w:pPr>
             <w:r>
               <w:rPr>
                 <w:rFonts w:ascii="Times New Roman" w:hAnsi="Times New Roman" w:cs="Times New Roman"/>
                 <w:sz w:val="18"/>
                 <w:szCs w:val="18"/>
               </w:rPr>
-              <w:t>-ная, об/мин</w:t>
-            </w:r>
-          </w:p>
-        </w:tc>
-        <w:tc>
-          <w:tcPr>
-            <w:tcW w:w="964" w:type="dxa"/>
-            <w:vAlign w:val="center"/>
-          </w:tcPr>
-          <w:p>
-            <w:pPr>
-              <w:jc w:val="center"/>
-              <w:rPr>
-                <w:rFonts w:ascii="Times New Roman" w:hAnsi="Times New Roman" w:cs="Times New Roman"/>
-                <w:sz w:val="18"/>
-                <w:szCs w:val="18"/>
-              </w:rPr>
-            </w:pPr>
-            <w:r>
-              <w:rPr>
-                <w:rFonts w:ascii="Times New Roman" w:hAnsi="Times New Roman" w:cs="Times New Roman"/>
-                <w:sz w:val="18"/>
-                <w:szCs w:val="18"/>
-              </w:rPr>
-              <w:t xml:space="preserve">Скорость хода </w:t>
-            </w:r>
-            <w:proofErr w:type="spellStart"/>
-            <w:r>
-              <w:rPr>
-                <w:rFonts w:ascii="Times New Roman" w:hAnsi="Times New Roman" w:cs="Times New Roman"/>
-                <w:sz w:val="18"/>
-                <w:szCs w:val="18"/>
-              </w:rPr>
-              <w:t>максималь</w:t>
-            </w:r>
-            <w:proofErr w:type="spellEnd"/>
-            <w:r>
-              <w:rPr>
-                <w:rFonts w:ascii="Times New Roman" w:hAnsi="Times New Roman" w:cs="Times New Roman"/>
-                <w:sz w:val="18"/>
-                <w:szCs w:val="18"/>
-              </w:rPr>
-              <w:t>-ная,</w:t>
+              <w:t>Скорость хода максималь-ная,</w:t>
             </w:r>
           </w:p>
           <w:p>
@@ -1335,19 +1247,8 @@
                 <w:szCs w:val="20"/>
               </w:rPr>
               <w:br/>
-            </w:r>
-            <w:proofErr w:type="spellStart"/>
-            <w:proofErr w:type="gramStart"/>
-            <w:r>
-              <w:rPr>
-                <w:rFonts w:ascii="Times New Roman" w:hAnsi="Times New Roman" w:cs="Times New Roman"/>
-                <w:sz w:val="20"/>
-                <w:szCs w:val="20"/>
-              </w:rPr>
               <w:t>дорож-ный</w:t>
             </w:r>
-            <w:proofErr w:type="spellEnd"/>
-            <w:proofErr w:type="gramEnd"/>
           </w:p>
         </w:tc>
         <w:tc>
@@ -2096,18 +1997,8 @@
                 <w:sz w:val="20"/>
                 <w:szCs w:val="20"/>
               </w:rPr>
-              <w:t xml:space="preserve">Коэффициент при интеграле </w:t>
-            </w:r>
-            <w:proofErr w:type="spellStart"/>
-            <w:r>
-              <w:rPr>
-                <w:rFonts w:ascii="Times New Roman" w:hAnsi="Times New Roman" w:cs="Times New Roman"/>
-                <w:sz w:val="20"/>
-                <w:szCs w:val="20"/>
-              </w:rPr>
-              <w:t>ai</w:t>
-            </w:r>
-            <w:proofErr w:type="spellEnd"/>
+              <w:t>Коэффициент при интеграле ai</w:t>
+            </w:r>
           </w:p>
         </w:tc>
       </w:tr>
@@ -2679,7 +2570,6 @@
                 <w:lang w:eastAsia="ru-RU"/>
               </w:rPr>
             </w:pPr>
-            <w:proofErr w:type="spellStart"/>
             <w:r>
               <w:rPr>
                 <w:rFonts w:ascii="Times New Roman" w:eastAsia="Times New Roman" w:hAnsi="Times New Roman" w:cs="Times New Roman"/>
@@ -2688,18 +2578,7 @@
                 <w:szCs w:val="28"/>
                 <w:lang w:eastAsia="ru-RU"/>
               </w:rPr>
-              <w:t>Амбросовская</w:t>
-            </w:r>
-            <w:proofErr w:type="spellEnd"/>
-            <w:r>
-              <w:rPr>
-                <w:rFonts w:ascii="Times New Roman" w:eastAsia="Times New Roman" w:hAnsi="Times New Roman" w:cs="Times New Roman"/>
-                <w:color w:val="000000"/>
-                <w:sz w:val="28"/>
-                <w:szCs w:val="28"/>
-                <w:lang w:eastAsia="ru-RU"/>
-              </w:rPr>
-              <w:t xml:space="preserve"> Е.Б.</w:t>
+              <w:t>Амбросовская Е.Б.</w:t>
             </w:r>
           </w:p>
         </w:tc>
@@ -3804,25 +3683,7 @@
           <w:sz w:val="28"/>
           <w:szCs w:val="28"/>
         </w:rPr>
-        <w:t xml:space="preserve">Целевая функция, как правило, отражает точность и эффективность управления, являясь скалярной функцией, в которой с помощью принципа </w:t>
-      </w:r>
-      <w:proofErr w:type="spellStart"/>
-      <w:r>
-        <w:rPr>
-          <w:rFonts w:ascii="Times New Roman" w:hAnsi="Times New Roman" w:cs="Times New Roman"/>
-          <w:sz w:val="28"/>
-          <w:szCs w:val="28"/>
-        </w:rPr>
-        <w:t>скаляризации</w:t>
-      </w:r>
-      <w:proofErr w:type="spellEnd"/>
-      <w:r>
-        <w:rPr>
-          <w:rFonts w:ascii="Times New Roman" w:hAnsi="Times New Roman" w:cs="Times New Roman"/>
-          <w:sz w:val="28"/>
-          <w:szCs w:val="28"/>
-        </w:rPr>
-        <w:t xml:space="preserve"> учтены несколько критериев многокритериальной оптимизации.</w:t>
+        <w:t>Целевая функция, как правило, отражает точность и эффективность управления, являясь скалярной функцией, в которой с помощью принципа скаляризации учтены несколько критериев многокритериальной оптимизации.</w:t>
       </w:r>
     </w:p>
     <w:p>
@@ -4634,25 +4495,7 @@
           <w:sz w:val="28"/>
           <w:szCs w:val="28"/>
         </w:rPr>
-        <w:t xml:space="preserve">, по формуле </w:t>
-      </w:r>
-      <w:proofErr w:type="spellStart"/>
-      <w:r>
-        <w:rPr>
-          <w:rFonts w:ascii="Times New Roman" w:eastAsiaTheme="minorEastAsia" w:hAnsi="Times New Roman" w:cs="Times New Roman"/>
-          <w:sz w:val="28"/>
-          <w:szCs w:val="28"/>
-        </w:rPr>
-        <w:t>Мумфорда</w:t>
-      </w:r>
-      <w:proofErr w:type="spellEnd"/>
-      <w:r>
-        <w:rPr>
-          <w:rFonts w:ascii="Times New Roman" w:eastAsiaTheme="minorEastAsia" w:hAnsi="Times New Roman" w:cs="Times New Roman"/>
-          <w:sz w:val="28"/>
-          <w:szCs w:val="28"/>
-        </w:rPr>
-        <w:t>, поскольку коэффициент общей полноты менее 0,75</w:t>
+        <w:t>, по формуле Мумфорда, поскольку коэффициент общей полноты менее 0,75</w:t>
       </w:r>
       <w:r>
         <w:rPr>
@@ -5626,27 +5469,7 @@
           <w:sz w:val="28"/>
           <w:szCs w:val="28"/>
         </w:rPr>
-        <w:t>588.5*v.*</w:t>
-      </w:r>
-      <w:proofErr w:type="spellStart"/>
-      <w:r>
-        <w:rPr>
-          <w:rFonts w:ascii="Times New Roman" w:eastAsiaTheme="minorEastAsia" w:hAnsi="Times New Roman" w:cs="Times New Roman"/>
-          <w:iCs/>
-          <w:sz w:val="28"/>
-          <w:szCs w:val="28"/>
-        </w:rPr>
-        <w:t>abs</w:t>
-      </w:r>
-      <w:proofErr w:type="spellEnd"/>
-      <w:r>
-        <w:rPr>
-          <w:rFonts w:ascii="Times New Roman" w:eastAsiaTheme="minorEastAsia" w:hAnsi="Times New Roman" w:cs="Times New Roman"/>
-          <w:iCs/>
-          <w:sz w:val="28"/>
-          <w:szCs w:val="28"/>
-        </w:rPr>
-        <w:t>(v);</w:t>
+        <w:t>588.5*v.*abs(v);</w:t>
       </w:r>
     </w:p>
     <w:p>
@@ -5670,31 +5493,7 @@
           <w:szCs w:val="28"/>
           <w:lang w:val="en-US"/>
         </w:rPr>
-        <w:t>plot(</w:t>
-      </w:r>
-      <w:proofErr w:type="spellStart"/>
-      <w:proofErr w:type="gramStart"/>
-      <w:r>
-        <w:rPr>
-          <w:rFonts w:ascii="Times New Roman" w:eastAsiaTheme="minorEastAsia" w:hAnsi="Times New Roman" w:cs="Times New Roman"/>
-          <w:iCs/>
-          <w:sz w:val="28"/>
-          <w:szCs w:val="28"/>
-          <w:lang w:val="en-US"/>
-        </w:rPr>
-        <w:t>v,R</w:t>
-      </w:r>
-      <w:proofErr w:type="spellEnd"/>
-      <w:proofErr w:type="gramEnd"/>
-      <w:r>
-        <w:rPr>
-          <w:rFonts w:ascii="Times New Roman" w:eastAsiaTheme="minorEastAsia" w:hAnsi="Times New Roman" w:cs="Times New Roman"/>
-          <w:iCs/>
-          <w:sz w:val="28"/>
-          <w:szCs w:val="28"/>
-          <w:lang w:val="en-US"/>
-        </w:rPr>
-        <w:t>)</w:t>
+        <w:t>plot(v,R)</w:t>
       </w:r>
     </w:p>
     <w:p>
@@ -5731,10 +5530,63 @@
           <w:iCs/>
           <w:sz w:val="28"/>
           <w:szCs w:val="28"/>
+        </w:rPr>
+      </w:pPr>
+      <w:r>
+        <w:rPr>
+          <w:rFonts w:ascii="Times New Roman" w:eastAsiaTheme="minorEastAsia" w:hAnsi="Times New Roman" w:cs="Times New Roman"/>
+          <w:iCs/>
+          <w:sz w:val="28"/>
+          <w:szCs w:val="28"/>
           <w:lang w:val="en-US"/>
         </w:rPr>
-      </w:pPr>
-      <w:proofErr w:type="gramStart"/>
+        <w:t>title</w:t>
+      </w:r>
+      <w:r>
+        <w:rPr>
+          <w:rFonts w:ascii="Times New Roman" w:eastAsiaTheme="minorEastAsia" w:hAnsi="Times New Roman" w:cs="Times New Roman"/>
+          <w:iCs/>
+          <w:sz w:val="28"/>
+          <w:szCs w:val="28"/>
+        </w:rPr>
+        <w:t>('</w:t>
+      </w:r>
+      <w:r>
+        <w:rPr>
+          <w:rFonts w:ascii="Times New Roman" w:eastAsiaTheme="minorEastAsia" w:hAnsi="Times New Roman" w:cs="Times New Roman"/>
+          <w:iCs/>
+          <w:sz w:val="28"/>
+          <w:szCs w:val="28"/>
+        </w:rPr>
+        <w:t>График</w:t>
+      </w:r>
+      <w:r>
+        <w:rPr>
+          <w:rFonts w:ascii="Times New Roman" w:eastAsiaTheme="minorEastAsia" w:hAnsi="Times New Roman" w:cs="Times New Roman"/>
+          <w:iCs/>
+          <w:sz w:val="28"/>
+          <w:szCs w:val="28"/>
+        </w:rPr>
+        <w:t xml:space="preserve"> </w:t>
+      </w:r>
+      <w:r>
+        <w:rPr>
+          <w:rFonts w:ascii="Times New Roman" w:eastAsiaTheme="minorEastAsia" w:hAnsi="Times New Roman" w:cs="Times New Roman"/>
+          <w:iCs/>
+          <w:sz w:val="28"/>
+          <w:szCs w:val="28"/>
+        </w:rPr>
+        <w:t>зависимости</w:t>
+      </w:r>
+      <w:r>
+        <w:rPr>
+          <w:rFonts w:ascii="Times New Roman" w:eastAsiaTheme="minorEastAsia" w:hAnsi="Times New Roman" w:cs="Times New Roman"/>
+          <w:iCs/>
+          <w:sz w:val="28"/>
+          <w:szCs w:val="28"/>
+        </w:rPr>
+        <w:t xml:space="preserve"> </w:t>
+      </w:r>
       <w:r>
         <w:rPr>
           <w:rFonts w:ascii="Times New Roman" w:eastAsiaTheme="minorEastAsia" w:hAnsi="Times New Roman" w:cs="Times New Roman"/>
@@ -5743,9 +5595,17 @@
           <w:szCs w:val="28"/>
           <w:lang w:val="en-US"/>
         </w:rPr>
-        <w:t>title(</w:t>
-      </w:r>
-      <w:proofErr w:type="gramEnd"/>
+        <w:t>R</w:t>
+      </w:r>
+      <w:r>
+        <w:rPr>
+          <w:rFonts w:ascii="Times New Roman" w:eastAsiaTheme="minorEastAsia" w:hAnsi="Times New Roman" w:cs="Times New Roman"/>
+          <w:iCs/>
+          <w:sz w:val="28"/>
+          <w:szCs w:val="28"/>
+        </w:rPr>
+        <w:t>(</w:t>
+      </w:r>
       <w:r>
         <w:rPr>
           <w:rFonts w:ascii="Times New Roman" w:eastAsiaTheme="minorEastAsia" w:hAnsi="Times New Roman" w:cs="Times New Roman"/>
@@ -5754,45 +5614,16 @@
           <w:szCs w:val="28"/>
           <w:lang w:val="en-US"/>
         </w:rPr>
-        <w:t>'</w:t>
-      </w:r>
-      <w:r>
-        <w:rPr>
-          <w:rFonts w:ascii="Times New Roman" w:eastAsiaTheme="minorEastAsia" w:hAnsi="Times New Roman" w:cs="Times New Roman"/>
-          <w:iCs/>
-          <w:sz w:val="28"/>
-          <w:szCs w:val="28"/>
-        </w:rPr>
-        <w:t>График</w:t>
-      </w:r>
-      <w:r>
-        <w:rPr>
-          <w:rFonts w:ascii="Times New Roman" w:eastAsiaTheme="minorEastAsia" w:hAnsi="Times New Roman" w:cs="Times New Roman"/>
-          <w:iCs/>
-          <w:sz w:val="28"/>
-          <w:szCs w:val="28"/>
-          <w:lang w:val="en-US"/>
-        </w:rPr>
-        <w:t xml:space="preserve"> </w:t>
-      </w:r>
-      <w:r>
-        <w:rPr>
-          <w:rFonts w:ascii="Times New Roman" w:eastAsiaTheme="minorEastAsia" w:hAnsi="Times New Roman" w:cs="Times New Roman"/>
-          <w:iCs/>
-          <w:sz w:val="28"/>
-          <w:szCs w:val="28"/>
-        </w:rPr>
-        <w:t>зависимости</w:t>
-      </w:r>
-      <w:r>
-        <w:rPr>
-          <w:rFonts w:ascii="Times New Roman" w:eastAsiaTheme="minorEastAsia" w:hAnsi="Times New Roman" w:cs="Times New Roman"/>
-          <w:iCs/>
-          <w:sz w:val="28"/>
-          <w:szCs w:val="28"/>
-          <w:lang w:val="en-US"/>
-        </w:rPr>
-        <w:t xml:space="preserve"> R(V)')</w:t>
+        <w:t>V</w:t>
+      </w:r>
+      <w:r>
+        <w:rPr>
+          <w:rFonts w:ascii="Times New Roman" w:eastAsiaTheme="minorEastAsia" w:hAnsi="Times New Roman" w:cs="Times New Roman"/>
+          <w:iCs/>
+          <w:sz w:val="28"/>
+          <w:szCs w:val="28"/>
+        </w:rPr>
+        <w:t>)')</w:t>
       </w:r>
     </w:p>
     <w:p>
@@ -5805,11 +5636,27 @@
           <w:iCs/>
           <w:sz w:val="28"/>
           <w:szCs w:val="28"/>
+        </w:rPr>
+      </w:pPr>
+      <w:r>
+        <w:rPr>
+          <w:rFonts w:ascii="Times New Roman" w:eastAsiaTheme="minorEastAsia" w:hAnsi="Times New Roman" w:cs="Times New Roman"/>
+          <w:iCs/>
+          <w:sz w:val="28"/>
+          <w:szCs w:val="28"/>
           <w:lang w:val="en-US"/>
         </w:rPr>
-      </w:pPr>
-      <w:proofErr w:type="spellStart"/>
-      <w:proofErr w:type="gramStart"/>
+        <w:t>xlabel</w:t>
+      </w:r>
+      <w:r>
+        <w:rPr>
+          <w:rFonts w:ascii="Times New Roman" w:eastAsiaTheme="minorEastAsia" w:hAnsi="Times New Roman" w:cs="Times New Roman"/>
+          <w:iCs/>
+          <w:sz w:val="28"/>
+          <w:szCs w:val="28"/>
+        </w:rPr>
+        <w:t>('</w:t>
+      </w:r>
       <w:r>
         <w:rPr>
           <w:rFonts w:ascii="Times New Roman" w:eastAsiaTheme="minorEastAsia" w:hAnsi="Times New Roman" w:cs="Times New Roman"/>
@@ -5818,29 +5665,16 @@
           <w:szCs w:val="28"/>
           <w:lang w:val="en-US"/>
         </w:rPr>
-        <w:t>xlabel</w:t>
-      </w:r>
-      <w:proofErr w:type="spellEnd"/>
-      <w:r>
-        <w:rPr>
-          <w:rFonts w:ascii="Times New Roman" w:eastAsiaTheme="minorEastAsia" w:hAnsi="Times New Roman" w:cs="Times New Roman"/>
-          <w:iCs/>
-          <w:sz w:val="28"/>
-          <w:szCs w:val="28"/>
-          <w:lang w:val="en-US"/>
-        </w:rPr>
-        <w:t>(</w:t>
-      </w:r>
-      <w:proofErr w:type="gramEnd"/>
-      <w:r>
-        <w:rPr>
-          <w:rFonts w:ascii="Times New Roman" w:eastAsiaTheme="minorEastAsia" w:hAnsi="Times New Roman" w:cs="Times New Roman"/>
-          <w:iCs/>
-          <w:sz w:val="28"/>
-          <w:szCs w:val="28"/>
-          <w:lang w:val="en-US"/>
-        </w:rPr>
-        <w:t xml:space="preserve">'v, </w:t>
+        <w:t>v</w:t>
+      </w:r>
+      <w:r>
+        <w:rPr>
+          <w:rFonts w:ascii="Times New Roman" w:eastAsiaTheme="minorEastAsia" w:hAnsi="Times New Roman" w:cs="Times New Roman"/>
+          <w:iCs/>
+          <w:sz w:val="28"/>
+          <w:szCs w:val="28"/>
+        </w:rPr>
+        <w:t xml:space="preserve">, </w:t>
       </w:r>
       <w:r>
         <w:rPr>
@@ -5857,7 +5691,6 @@
           <w:iCs/>
           <w:sz w:val="28"/>
           <w:szCs w:val="28"/>
-          <w:lang w:val="en-US"/>
         </w:rPr>
         <w:t>/</w:t>
       </w:r>
@@ -5876,7 +5709,6 @@
           <w:iCs/>
           <w:sz w:val="28"/>
           <w:szCs w:val="28"/>
-          <w:lang w:val="en-US"/>
         </w:rPr>
         <w:t>')</w:t>
       </w:r>
@@ -5891,11 +5723,27 @@
           <w:iCs/>
           <w:sz w:val="28"/>
           <w:szCs w:val="28"/>
+        </w:rPr>
+      </w:pPr>
+      <w:r>
+        <w:rPr>
+          <w:rFonts w:ascii="Times New Roman" w:eastAsiaTheme="minorEastAsia" w:hAnsi="Times New Roman" w:cs="Times New Roman"/>
+          <w:iCs/>
+          <w:sz w:val="28"/>
+          <w:szCs w:val="28"/>
           <w:lang w:val="en-US"/>
         </w:rPr>
-      </w:pPr>
-      <w:proofErr w:type="spellStart"/>
-      <w:proofErr w:type="gramStart"/>
+        <w:t>ylabel</w:t>
+      </w:r>
+      <w:r>
+        <w:rPr>
+          <w:rFonts w:ascii="Times New Roman" w:eastAsiaTheme="minorEastAsia" w:hAnsi="Times New Roman" w:cs="Times New Roman"/>
+          <w:iCs/>
+          <w:sz w:val="28"/>
+          <w:szCs w:val="28"/>
+        </w:rPr>
+        <w:t>('</w:t>
+      </w:r>
       <w:r>
         <w:rPr>
           <w:rFonts w:ascii="Times New Roman" w:eastAsiaTheme="minorEastAsia" w:hAnsi="Times New Roman" w:cs="Times New Roman"/>
@@ -5904,29 +5752,16 @@
           <w:szCs w:val="28"/>
           <w:lang w:val="en-US"/>
         </w:rPr>
-        <w:t>ylabel</w:t>
-      </w:r>
-      <w:proofErr w:type="spellEnd"/>
-      <w:r>
-        <w:rPr>
-          <w:rFonts w:ascii="Times New Roman" w:eastAsiaTheme="minorEastAsia" w:hAnsi="Times New Roman" w:cs="Times New Roman"/>
-          <w:iCs/>
-          <w:sz w:val="28"/>
-          <w:szCs w:val="28"/>
-          <w:lang w:val="en-US"/>
-        </w:rPr>
-        <w:t>(</w:t>
-      </w:r>
-      <w:proofErr w:type="gramEnd"/>
-      <w:r>
-        <w:rPr>
-          <w:rFonts w:ascii="Times New Roman" w:eastAsiaTheme="minorEastAsia" w:hAnsi="Times New Roman" w:cs="Times New Roman"/>
-          <w:iCs/>
-          <w:sz w:val="28"/>
-          <w:szCs w:val="28"/>
-          <w:lang w:val="en-US"/>
-        </w:rPr>
-        <w:t xml:space="preserve">'R, </w:t>
+        <w:t>R</w:t>
+      </w:r>
+      <w:r>
+        <w:rPr>
+          <w:rFonts w:ascii="Times New Roman" w:eastAsiaTheme="minorEastAsia" w:hAnsi="Times New Roman" w:cs="Times New Roman"/>
+          <w:iCs/>
+          <w:sz w:val="28"/>
+          <w:szCs w:val="28"/>
+        </w:rPr>
+        <w:t xml:space="preserve">, </w:t>
       </w:r>
       <w:r>
         <w:rPr>
@@ -5943,7 +5778,6 @@
           <w:iCs/>
           <w:sz w:val="28"/>
           <w:szCs w:val="28"/>
-          <w:lang w:val="en-US"/>
         </w:rPr>
         <w:t>')</w:t>
       </w:r>
@@ -8195,7 +8029,15 @@
                   <w:sz w:val="28"/>
                   <w:szCs w:val="28"/>
                 </w:rPr>
-                <m:t>98.52</m:t>
+                <m:t>98</m:t>
+              </m:r>
+              <m:r>
+                <w:rPr>
+                  <w:rFonts w:ascii="Cambria Math" w:eastAsiaTheme="minorEastAsia" w:hAnsi="Cambria Math" w:cs="Times New Roman"/>
+                  <w:sz w:val="28"/>
+                  <w:szCs w:val="28"/>
+                </w:rPr>
+                <m:t>520</m:t>
               </m:r>
             </m:num>
             <m:den>
@@ -8351,7 +8193,7 @@
                   <w:szCs w:val="28"/>
                   <w:lang w:val="en-US"/>
                 </w:rPr>
-                <m:t>8</m:t>
+                <m:t>5</m:t>
               </m:r>
             </m:sup>
           </m:sSup>
@@ -8561,7 +8403,7 @@
                   <w:szCs w:val="28"/>
                   <w:lang w:val="en-US"/>
                 </w:rPr>
-                <m:t>8</m:t>
+                <m:t>5</m:t>
               </m:r>
             </m:sup>
           </m:sSup>
@@ -8610,7 +8452,7 @@
               <w:sz w:val="28"/>
               <w:szCs w:val="28"/>
             </w:rPr>
-            <m:t>=0.00055</m:t>
+            <m:t>=0.55</m:t>
           </m:r>
           <m:sSup>
             <m:sSupPr>
@@ -8858,29 +8700,7 @@
           <w:szCs w:val="28"/>
           <w:lang w:val="en-US"/>
         </w:rPr>
-        <w:t>plot(</w:t>
-      </w:r>
-      <w:proofErr w:type="spellStart"/>
-      <w:proofErr w:type="gramStart"/>
-      <w:r>
-        <w:rPr>
-          <w:rFonts w:ascii="Times New Roman" w:hAnsi="Times New Roman" w:cs="Times New Roman"/>
-          <w:sz w:val="28"/>
-          <w:szCs w:val="28"/>
-          <w:lang w:val="en-US"/>
-        </w:rPr>
-        <w:t>n,T</w:t>
-      </w:r>
-      <w:proofErr w:type="spellEnd"/>
-      <w:proofErr w:type="gramEnd"/>
-      <w:r>
-        <w:rPr>
-          <w:rFonts w:ascii="Times New Roman" w:hAnsi="Times New Roman" w:cs="Times New Roman"/>
-          <w:sz w:val="28"/>
-          <w:szCs w:val="28"/>
-          <w:lang w:val="en-US"/>
-        </w:rPr>
-        <w:t xml:space="preserve">) </w:t>
+        <w:t xml:space="preserve">plot(n,T) </w:t>
       </w:r>
     </w:p>
     <w:p>
@@ -8914,105 +8734,88 @@
           <w:rFonts w:ascii="Times New Roman" w:hAnsi="Times New Roman" w:cs="Times New Roman"/>
           <w:sz w:val="28"/>
           <w:szCs w:val="28"/>
+        </w:rPr>
+      </w:pPr>
+      <w:r>
+        <w:rPr>
+          <w:rFonts w:ascii="Times New Roman" w:hAnsi="Times New Roman" w:cs="Times New Roman"/>
+          <w:sz w:val="28"/>
+          <w:szCs w:val="28"/>
           <w:lang w:val="en-US"/>
         </w:rPr>
-      </w:pPr>
-      <w:proofErr w:type="gramStart"/>
+        <w:t>title</w:t>
+      </w:r>
       <w:r>
         <w:rPr>
           <w:rFonts w:ascii="Times New Roman" w:hAnsi="Times New Roman" w:cs="Times New Roman"/>
           <w:sz w:val="28"/>
           <w:szCs w:val="28"/>
+        </w:rPr>
+        <w:t>('</w:t>
+      </w:r>
+      <w:r>
+        <w:rPr>
+          <w:rFonts w:ascii="Times New Roman" w:hAnsi="Times New Roman" w:cs="Times New Roman"/>
+          <w:sz w:val="28"/>
+          <w:szCs w:val="28"/>
+        </w:rPr>
+        <w:t>График</w:t>
+      </w:r>
+      <w:r>
+        <w:rPr>
+          <w:rFonts w:ascii="Times New Roman" w:hAnsi="Times New Roman" w:cs="Times New Roman"/>
+          <w:sz w:val="28"/>
+          <w:szCs w:val="28"/>
+        </w:rPr>
+        <w:t xml:space="preserve"> </w:t>
+      </w:r>
+      <w:r>
+        <w:rPr>
+          <w:rFonts w:ascii="Times New Roman" w:hAnsi="Times New Roman" w:cs="Times New Roman"/>
+          <w:sz w:val="28"/>
+          <w:szCs w:val="28"/>
+        </w:rPr>
+        <w:t>зависимости</w:t>
+      </w:r>
+      <w:r>
+        <w:rPr>
+          <w:rFonts w:ascii="Times New Roman" w:hAnsi="Times New Roman" w:cs="Times New Roman"/>
+          <w:sz w:val="28"/>
+          <w:szCs w:val="28"/>
+        </w:rPr>
+        <w:t xml:space="preserve"> </w:t>
+      </w:r>
+      <w:r>
+        <w:rPr>
+          <w:rFonts w:ascii="Times New Roman" w:hAnsi="Times New Roman" w:cs="Times New Roman"/>
+          <w:sz w:val="28"/>
+          <w:szCs w:val="28"/>
           <w:lang w:val="en-US"/>
         </w:rPr>
-        <w:t>title</w:t>
+        <w:t>T</w:t>
       </w:r>
       <w:r>
         <w:rPr>
           <w:rFonts w:ascii="Times New Roman" w:hAnsi="Times New Roman" w:cs="Times New Roman"/>
           <w:sz w:val="28"/>
           <w:szCs w:val="28"/>
+        </w:rPr>
+        <w:t>(</w:t>
+      </w:r>
+      <w:r>
+        <w:rPr>
+          <w:rFonts w:ascii="Times New Roman" w:hAnsi="Times New Roman" w:cs="Times New Roman"/>
+          <w:sz w:val="28"/>
+          <w:szCs w:val="28"/>
           <w:lang w:val="en-US"/>
         </w:rPr>
-        <w:t>(</w:t>
-      </w:r>
-      <w:proofErr w:type="gramEnd"/>
+        <w:t>n</w:t>
+      </w:r>
       <w:r>
         <w:rPr>
           <w:rFonts w:ascii="Times New Roman" w:hAnsi="Times New Roman" w:cs="Times New Roman"/>
           <w:sz w:val="28"/>
           <w:szCs w:val="28"/>
-          <w:lang w:val="en-US"/>
-        </w:rPr>
-        <w:t>'</w:t>
-      </w:r>
-      <w:r>
-        <w:rPr>
-          <w:rFonts w:ascii="Times New Roman" w:hAnsi="Times New Roman" w:cs="Times New Roman"/>
-          <w:sz w:val="28"/>
-          <w:szCs w:val="28"/>
-        </w:rPr>
-        <w:t>График</w:t>
-      </w:r>
-      <w:r>
-        <w:rPr>
-          <w:rFonts w:ascii="Times New Roman" w:hAnsi="Times New Roman" w:cs="Times New Roman"/>
-          <w:sz w:val="28"/>
-          <w:szCs w:val="28"/>
-          <w:lang w:val="en-US"/>
-        </w:rPr>
-        <w:t xml:space="preserve"> </w:t>
-      </w:r>
-      <w:r>
-        <w:rPr>
-          <w:rFonts w:ascii="Times New Roman" w:hAnsi="Times New Roman" w:cs="Times New Roman"/>
-          <w:sz w:val="28"/>
-          <w:szCs w:val="28"/>
-        </w:rPr>
-        <w:t>зависимости</w:t>
-      </w:r>
-      <w:r>
-        <w:rPr>
-          <w:rFonts w:ascii="Times New Roman" w:hAnsi="Times New Roman" w:cs="Times New Roman"/>
-          <w:sz w:val="28"/>
-          <w:szCs w:val="28"/>
-          <w:lang w:val="en-US"/>
-        </w:rPr>
-        <w:t xml:space="preserve"> </w:t>
-      </w:r>
-      <w:r>
-        <w:rPr>
-          <w:rFonts w:ascii="Times New Roman" w:hAnsi="Times New Roman" w:cs="Times New Roman"/>
-          <w:sz w:val="28"/>
-          <w:szCs w:val="28"/>
-          <w:lang w:val="en-US"/>
-        </w:rPr>
-        <w:t>T</w:t>
-      </w:r>
-      <w:r>
-        <w:rPr>
-          <w:rFonts w:ascii="Times New Roman" w:hAnsi="Times New Roman" w:cs="Times New Roman"/>
-          <w:sz w:val="28"/>
-          <w:szCs w:val="28"/>
-          <w:lang w:val="en-US"/>
-        </w:rPr>
-        <w:t>(</w:t>
-      </w:r>
-      <w:r>
-        <w:rPr>
-          <w:rFonts w:ascii="Times New Roman" w:hAnsi="Times New Roman" w:cs="Times New Roman"/>
-          <w:sz w:val="28"/>
-          <w:szCs w:val="28"/>
-          <w:lang w:val="en-US"/>
-        </w:rPr>
-        <w:t>n</w:t>
-      </w:r>
-      <w:r>
-        <w:rPr>
-          <w:rFonts w:ascii="Times New Roman" w:hAnsi="Times New Roman" w:cs="Times New Roman"/>
-          <w:sz w:val="28"/>
-          <w:szCs w:val="28"/>
-          <w:lang w:val="en-US"/>
         </w:rPr>
         <w:t>)')</w:t>
       </w:r>
@@ -9026,89 +8829,71 @@
           <w:rFonts w:ascii="Times New Roman" w:hAnsi="Times New Roman" w:cs="Times New Roman"/>
           <w:sz w:val="28"/>
           <w:szCs w:val="28"/>
+        </w:rPr>
+      </w:pPr>
+      <w:r>
+        <w:rPr>
+          <w:rFonts w:ascii="Times New Roman" w:hAnsi="Times New Roman" w:cs="Times New Roman"/>
+          <w:sz w:val="28"/>
+          <w:szCs w:val="28"/>
           <w:lang w:val="en-US"/>
         </w:rPr>
-      </w:pPr>
-      <w:proofErr w:type="spellStart"/>
-      <w:proofErr w:type="gramStart"/>
+        <w:t>xlabel</w:t>
+      </w:r>
       <w:r>
         <w:rPr>
           <w:rFonts w:ascii="Times New Roman" w:hAnsi="Times New Roman" w:cs="Times New Roman"/>
           <w:sz w:val="28"/>
           <w:szCs w:val="28"/>
+        </w:rPr>
+        <w:t>('</w:t>
+      </w:r>
+      <w:r>
+        <w:rPr>
+          <w:rFonts w:ascii="Times New Roman" w:hAnsi="Times New Roman" w:cs="Times New Roman"/>
+          <w:sz w:val="28"/>
+          <w:szCs w:val="28"/>
           <w:lang w:val="en-US"/>
         </w:rPr>
-        <w:t>xlabel</w:t>
-      </w:r>
-      <w:proofErr w:type="spellEnd"/>
+        <w:t>n</w:t>
+      </w:r>
       <w:r>
         <w:rPr>
           <w:rFonts w:ascii="Times New Roman" w:hAnsi="Times New Roman" w:cs="Times New Roman"/>
           <w:sz w:val="28"/>
           <w:szCs w:val="28"/>
-          <w:lang w:val="en-US"/>
-        </w:rPr>
-        <w:t>(</w:t>
-      </w:r>
-      <w:proofErr w:type="gramEnd"/>
+        </w:rPr>
+        <w:t xml:space="preserve">, </w:t>
+      </w:r>
       <w:r>
         <w:rPr>
           <w:rFonts w:ascii="Times New Roman" w:hAnsi="Times New Roman" w:cs="Times New Roman"/>
           <w:sz w:val="28"/>
           <w:szCs w:val="28"/>
-          <w:lang w:val="en-US"/>
-        </w:rPr>
-        <w:t>'</w:t>
+        </w:rPr>
+        <w:t>об</w:t>
       </w:r>
       <w:r>
         <w:rPr>
           <w:rFonts w:ascii="Times New Roman" w:hAnsi="Times New Roman" w:cs="Times New Roman"/>
           <w:sz w:val="28"/>
           <w:szCs w:val="28"/>
-          <w:lang w:val="en-US"/>
-        </w:rPr>
-        <w:t>n</w:t>
+        </w:rPr>
+        <w:t>/</w:t>
       </w:r>
       <w:r>
         <w:rPr>
           <w:rFonts w:ascii="Times New Roman" w:hAnsi="Times New Roman" w:cs="Times New Roman"/>
           <w:sz w:val="28"/>
           <w:szCs w:val="28"/>
-          <w:lang w:val="en-US"/>
-        </w:rPr>
-        <w:t xml:space="preserve">, </w:t>
+        </w:rPr>
+        <w:t>мин</w:t>
       </w:r>
       <w:r>
         <w:rPr>
           <w:rFonts w:ascii="Times New Roman" w:hAnsi="Times New Roman" w:cs="Times New Roman"/>
           <w:sz w:val="28"/>
           <w:szCs w:val="28"/>
-        </w:rPr>
-        <w:t>об</w:t>
-      </w:r>
-      <w:r>
-        <w:rPr>
-          <w:rFonts w:ascii="Times New Roman" w:hAnsi="Times New Roman" w:cs="Times New Roman"/>
-          <w:sz w:val="28"/>
-          <w:szCs w:val="28"/>
-          <w:lang w:val="en-US"/>
-        </w:rPr>
-        <w:t>/</w:t>
-      </w:r>
-      <w:r>
-        <w:rPr>
-          <w:rFonts w:ascii="Times New Roman" w:hAnsi="Times New Roman" w:cs="Times New Roman"/>
-          <w:sz w:val="28"/>
-          <w:szCs w:val="28"/>
-        </w:rPr>
-        <w:t>мин</w:t>
-      </w:r>
-      <w:r>
-        <w:rPr>
-          <w:rFonts w:ascii="Times New Roman" w:hAnsi="Times New Roman" w:cs="Times New Roman"/>
-          <w:sz w:val="28"/>
-          <w:szCs w:val="28"/>
-          <w:lang w:val="en-US"/>
         </w:rPr>
         <w:t>')</w:t>
       </w:r>
@@ -9124,8 +8909,6 @@
           <w:szCs w:val="28"/>
         </w:rPr>
       </w:pPr>
-      <w:proofErr w:type="spellStart"/>
-      <w:proofErr w:type="gramStart"/>
       <w:r>
         <w:rPr>
           <w:rFonts w:ascii="Times New Roman" w:hAnsi="Times New Roman" w:cs="Times New Roman"/>
@@ -9135,23 +8918,13 @@
         </w:rPr>
         <w:t>ylabel</w:t>
       </w:r>
-      <w:proofErr w:type="spellEnd"/>
       <w:r>
         <w:rPr>
           <w:rFonts w:ascii="Times New Roman" w:hAnsi="Times New Roman" w:cs="Times New Roman"/>
           <w:sz w:val="28"/>
           <w:szCs w:val="28"/>
         </w:rPr>
-        <w:t>(</w:t>
-      </w:r>
-      <w:proofErr w:type="gramEnd"/>
-      <w:r>
-        <w:rPr>
-          <w:rFonts w:ascii="Times New Roman" w:hAnsi="Times New Roman" w:cs="Times New Roman"/>
-          <w:sz w:val="28"/>
-          <w:szCs w:val="28"/>
-        </w:rPr>
-        <w:t>'</w:t>
+        <w:t>('</w:t>
       </w:r>
       <w:r>
         <w:rPr>
@@ -11352,6 +11125,7 @@
           <w:iCs/>
           <w:sz w:val="28"/>
           <w:szCs w:val="28"/>
+          <w:lang w:val="en-US"/>
         </w:rPr>
       </w:pPr>
       <w:r>
@@ -11370,37 +11144,18 @@
           <w:iCs/>
           <w:sz w:val="28"/>
           <w:szCs w:val="28"/>
-        </w:rPr>
-        <w:t>1 = (0.0518/1000</w:t>
-      </w:r>
-      <w:proofErr w:type="gramStart"/>
-      <w:r>
-        <w:rPr>
-          <w:rFonts w:ascii="Times New Roman" w:eastAsiaTheme="minorEastAsia" w:hAnsi="Times New Roman" w:cs="Times New Roman"/>
-          <w:iCs/>
-          <w:sz w:val="28"/>
-          <w:szCs w:val="28"/>
-        </w:rPr>
-        <w:t>).*</w:t>
-      </w:r>
-      <w:proofErr w:type="gramEnd"/>
-      <w:r>
-        <w:rPr>
-          <w:rFonts w:ascii="Times New Roman" w:eastAsiaTheme="minorEastAsia" w:hAnsi="Times New Roman" w:cs="Times New Roman"/>
-          <w:iCs/>
-          <w:sz w:val="28"/>
-          <w:szCs w:val="28"/>
-        </w:rPr>
-        <w:t>(</w:t>
-      </w:r>
-      <w:r>
-        <w:rPr>
-          <w:rFonts w:ascii="Times New Roman" w:eastAsiaTheme="minorEastAsia" w:hAnsi="Times New Roman" w:cs="Times New Roman"/>
-          <w:iCs/>
-          <w:sz w:val="28"/>
-          <w:szCs w:val="28"/>
           <w:lang w:val="en-US"/>
         </w:rPr>
+        <w:t>1 = (0.0518/1000).*(</w:t>
+      </w:r>
+      <w:r>
+        <w:rPr>
+          <w:rFonts w:ascii="Times New Roman" w:eastAsiaTheme="minorEastAsia" w:hAnsi="Times New Roman" w:cs="Times New Roman"/>
+          <w:iCs/>
+          <w:sz w:val="28"/>
+          <w:szCs w:val="28"/>
+          <w:lang w:val="en-US"/>
+        </w:rPr>
         <w:t>n</w:t>
       </w:r>
       <w:r>
@@ -11409,6 +11164,7 @@
           <w:iCs/>
           <w:sz w:val="28"/>
           <w:szCs w:val="28"/>
+          <w:lang w:val="en-US"/>
         </w:rPr>
         <w:t>.^3);</w:t>
       </w:r>
@@ -11423,6 +11179,7 @@
           <w:iCs/>
           <w:sz w:val="28"/>
           <w:szCs w:val="28"/>
+          <w:lang w:val="en-US"/>
         </w:rPr>
       </w:pPr>
       <w:r>
@@ -11441,37 +11198,18 @@
           <w:iCs/>
           <w:sz w:val="28"/>
           <w:szCs w:val="28"/>
-        </w:rPr>
-        <w:t>2 = (1.1 *0.0518/1000</w:t>
-      </w:r>
-      <w:proofErr w:type="gramStart"/>
-      <w:r>
-        <w:rPr>
-          <w:rFonts w:ascii="Times New Roman" w:eastAsiaTheme="minorEastAsia" w:hAnsi="Times New Roman" w:cs="Times New Roman"/>
-          <w:iCs/>
-          <w:sz w:val="28"/>
-          <w:szCs w:val="28"/>
-        </w:rPr>
-        <w:t>).*</w:t>
-      </w:r>
-      <w:proofErr w:type="gramEnd"/>
-      <w:r>
-        <w:rPr>
-          <w:rFonts w:ascii="Times New Roman" w:eastAsiaTheme="minorEastAsia" w:hAnsi="Times New Roman" w:cs="Times New Roman"/>
-          <w:iCs/>
-          <w:sz w:val="28"/>
-          <w:szCs w:val="28"/>
-        </w:rPr>
-        <w:t>(</w:t>
-      </w:r>
-      <w:r>
-        <w:rPr>
-          <w:rFonts w:ascii="Times New Roman" w:eastAsiaTheme="minorEastAsia" w:hAnsi="Times New Roman" w:cs="Times New Roman"/>
-          <w:iCs/>
-          <w:sz w:val="28"/>
-          <w:szCs w:val="28"/>
           <w:lang w:val="en-US"/>
         </w:rPr>
+        <w:t>2 = (1.1 *0.0518/1000).*(</w:t>
+      </w:r>
+      <w:r>
+        <w:rPr>
+          <w:rFonts w:ascii="Times New Roman" w:eastAsiaTheme="minorEastAsia" w:hAnsi="Times New Roman" w:cs="Times New Roman"/>
+          <w:iCs/>
+          <w:sz w:val="28"/>
+          <w:szCs w:val="28"/>
+          <w:lang w:val="en-US"/>
+        </w:rPr>
         <w:t>n</w:t>
       </w:r>
       <w:r>
@@ -11480,6 +11218,7 @@
           <w:iCs/>
           <w:sz w:val="28"/>
           <w:szCs w:val="28"/>
+          <w:lang w:val="en-US"/>
         </w:rPr>
         <w:t>.^3);</w:t>
       </w:r>
@@ -11505,29 +11244,7 @@
           <w:szCs w:val="28"/>
           <w:lang w:val="en-US"/>
         </w:rPr>
-        <w:t>plot(</w:t>
-      </w:r>
-      <w:proofErr w:type="gramStart"/>
-      <w:r>
-        <w:rPr>
-          <w:rFonts w:ascii="Times New Roman" w:eastAsiaTheme="minorEastAsia" w:hAnsi="Times New Roman" w:cs="Times New Roman"/>
-          <w:iCs/>
-          <w:sz w:val="28"/>
-          <w:szCs w:val="28"/>
-          <w:lang w:val="en-US"/>
-        </w:rPr>
-        <w:t>n,P</w:t>
-      </w:r>
-      <w:proofErr w:type="gramEnd"/>
-      <w:r>
-        <w:rPr>
-          <w:rFonts w:ascii="Times New Roman" w:eastAsiaTheme="minorEastAsia" w:hAnsi="Times New Roman" w:cs="Times New Roman"/>
-          <w:iCs/>
-          <w:sz w:val="28"/>
-          <w:szCs w:val="28"/>
-          <w:lang w:val="en-US"/>
-        </w:rPr>
-        <w:t>1,n,P2)</w:t>
+        <w:t>plot(n,P1,n,P2)</w:t>
       </w:r>
     </w:p>
     <w:p>
@@ -11566,36 +11283,14 @@
           <w:szCs w:val="28"/>
         </w:rPr>
       </w:pPr>
-      <w:proofErr w:type="spellStart"/>
-      <w:proofErr w:type="gramStart"/>
-      <w:r>
-        <w:rPr>
-          <w:rFonts w:ascii="Times New Roman" w:eastAsiaTheme="minorEastAsia" w:hAnsi="Times New Roman" w:cs="Times New Roman"/>
-          <w:iCs/>
-          <w:sz w:val="28"/>
-          <w:szCs w:val="28"/>
-        </w:rPr>
-        <w:t>title</w:t>
-      </w:r>
-      <w:proofErr w:type="spellEnd"/>
-      <w:r>
-        <w:rPr>
-          <w:rFonts w:ascii="Times New Roman" w:eastAsiaTheme="minorEastAsia" w:hAnsi="Times New Roman" w:cs="Times New Roman"/>
-          <w:iCs/>
-          <w:sz w:val="28"/>
-          <w:szCs w:val="28"/>
-        </w:rPr>
-        <w:t>(</w:t>
-      </w:r>
-      <w:proofErr w:type="gramEnd"/>
-      <w:r>
-        <w:rPr>
-          <w:rFonts w:ascii="Times New Roman" w:eastAsiaTheme="minorEastAsia" w:hAnsi="Times New Roman" w:cs="Times New Roman"/>
-          <w:iCs/>
-          <w:sz w:val="28"/>
-          <w:szCs w:val="28"/>
-        </w:rPr>
-        <w:t>'График зависимости мощности двигателя P(n)')</w:t>
+      <w:r>
+        <w:rPr>
+          <w:rFonts w:ascii="Times New Roman" w:eastAsiaTheme="minorEastAsia" w:hAnsi="Times New Roman" w:cs="Times New Roman"/>
+          <w:iCs/>
+          <w:sz w:val="28"/>
+          <w:szCs w:val="28"/>
+        </w:rPr>
+        <w:t>title('График зависимости мощности двигателя P(n)')</w:t>
       </w:r>
     </w:p>
     <w:p>
@@ -11610,36 +11305,14 @@
           <w:szCs w:val="28"/>
         </w:rPr>
       </w:pPr>
-      <w:proofErr w:type="spellStart"/>
-      <w:proofErr w:type="gramStart"/>
-      <w:r>
-        <w:rPr>
-          <w:rFonts w:ascii="Times New Roman" w:eastAsiaTheme="minorEastAsia" w:hAnsi="Times New Roman" w:cs="Times New Roman"/>
-          <w:iCs/>
-          <w:sz w:val="28"/>
-          <w:szCs w:val="28"/>
-        </w:rPr>
-        <w:t>xlabel</w:t>
-      </w:r>
-      <w:proofErr w:type="spellEnd"/>
-      <w:r>
-        <w:rPr>
-          <w:rFonts w:ascii="Times New Roman" w:eastAsiaTheme="minorEastAsia" w:hAnsi="Times New Roman" w:cs="Times New Roman"/>
-          <w:iCs/>
-          <w:sz w:val="28"/>
-          <w:szCs w:val="28"/>
-        </w:rPr>
-        <w:t>(</w:t>
-      </w:r>
-      <w:proofErr w:type="gramEnd"/>
-      <w:r>
-        <w:rPr>
-          <w:rFonts w:ascii="Times New Roman" w:eastAsiaTheme="minorEastAsia" w:hAnsi="Times New Roman" w:cs="Times New Roman"/>
-          <w:iCs/>
-          <w:sz w:val="28"/>
-          <w:szCs w:val="28"/>
-        </w:rPr>
-        <w:t>'n, об/мин')</w:t>
+      <w:r>
+        <w:rPr>
+          <w:rFonts w:ascii="Times New Roman" w:eastAsiaTheme="minorEastAsia" w:hAnsi="Times New Roman" w:cs="Times New Roman"/>
+          <w:iCs/>
+          <w:sz w:val="28"/>
+          <w:szCs w:val="28"/>
+        </w:rPr>
+        <w:t>xlabel('n, об/мин')</w:t>
       </w:r>
     </w:p>
     <w:p>
@@ -11654,56 +11327,14 @@
           <w:szCs w:val="28"/>
         </w:rPr>
       </w:pPr>
-      <w:proofErr w:type="spellStart"/>
-      <w:proofErr w:type="gramStart"/>
-      <w:r>
-        <w:rPr>
-          <w:rFonts w:ascii="Times New Roman" w:eastAsiaTheme="minorEastAsia" w:hAnsi="Times New Roman" w:cs="Times New Roman"/>
-          <w:iCs/>
-          <w:sz w:val="28"/>
-          <w:szCs w:val="28"/>
-        </w:rPr>
-        <w:t>ylabel</w:t>
-      </w:r>
-      <w:proofErr w:type="spellEnd"/>
-      <w:r>
-        <w:rPr>
-          <w:rFonts w:ascii="Times New Roman" w:eastAsiaTheme="minorEastAsia" w:hAnsi="Times New Roman" w:cs="Times New Roman"/>
-          <w:iCs/>
-          <w:sz w:val="28"/>
-          <w:szCs w:val="28"/>
-        </w:rPr>
-        <w:t>(</w:t>
-      </w:r>
-      <w:proofErr w:type="gramEnd"/>
-      <w:r>
-        <w:rPr>
-          <w:rFonts w:ascii="Times New Roman" w:eastAsiaTheme="minorEastAsia" w:hAnsi="Times New Roman" w:cs="Times New Roman"/>
-          <w:iCs/>
-          <w:sz w:val="28"/>
-          <w:szCs w:val="28"/>
-        </w:rPr>
-        <w:t>'</w:t>
-      </w:r>
-      <w:proofErr w:type="spellStart"/>
-      <w:r>
-        <w:rPr>
-          <w:rFonts w:ascii="Times New Roman" w:eastAsiaTheme="minorEastAsia" w:hAnsi="Times New Roman" w:cs="Times New Roman"/>
-          <w:iCs/>
-          <w:sz w:val="28"/>
-          <w:szCs w:val="28"/>
-        </w:rPr>
-        <w:t>Pe</w:t>
-      </w:r>
-      <w:proofErr w:type="spellEnd"/>
-      <w:r>
-        <w:rPr>
-          <w:rFonts w:ascii="Times New Roman" w:eastAsiaTheme="minorEastAsia" w:hAnsi="Times New Roman" w:cs="Times New Roman"/>
-          <w:iCs/>
-          <w:sz w:val="28"/>
-          <w:szCs w:val="28"/>
-        </w:rPr>
-        <w:t>, кВт')</w:t>
+      <w:r>
+        <w:rPr>
+          <w:rFonts w:ascii="Times New Roman" w:eastAsiaTheme="minorEastAsia" w:hAnsi="Times New Roman" w:cs="Times New Roman"/>
+          <w:iCs/>
+          <w:sz w:val="28"/>
+          <w:szCs w:val="28"/>
+        </w:rPr>
+        <w:t>ylabel('Pe, кВт')</w:t>
       </w:r>
     </w:p>
     <w:p>
@@ -11718,56 +11349,14 @@
           <w:szCs w:val="28"/>
         </w:rPr>
       </w:pPr>
-      <w:proofErr w:type="spellStart"/>
-      <w:proofErr w:type="gramStart"/>
-      <w:r>
-        <w:rPr>
-          <w:rFonts w:ascii="Times New Roman" w:eastAsiaTheme="minorEastAsia" w:hAnsi="Times New Roman" w:cs="Times New Roman"/>
-          <w:iCs/>
-          <w:sz w:val="28"/>
-          <w:szCs w:val="28"/>
-        </w:rPr>
-        <w:t>legend</w:t>
-      </w:r>
-      <w:proofErr w:type="spellEnd"/>
-      <w:r>
-        <w:rPr>
-          <w:rFonts w:ascii="Times New Roman" w:eastAsiaTheme="minorEastAsia" w:hAnsi="Times New Roman" w:cs="Times New Roman"/>
-          <w:iCs/>
-          <w:sz w:val="28"/>
-          <w:szCs w:val="28"/>
-        </w:rPr>
-        <w:t>(</w:t>
-      </w:r>
-      <w:proofErr w:type="gramEnd"/>
-      <w:r>
-        <w:rPr>
-          <w:rFonts w:ascii="Times New Roman" w:eastAsiaTheme="minorEastAsia" w:hAnsi="Times New Roman" w:cs="Times New Roman"/>
-          <w:iCs/>
-          <w:sz w:val="28"/>
-          <w:szCs w:val="28"/>
-        </w:rPr>
-        <w:t xml:space="preserve">'На свободном </w:t>
-      </w:r>
-      <w:proofErr w:type="spellStart"/>
-      <w:r>
-        <w:rPr>
-          <w:rFonts w:ascii="Times New Roman" w:eastAsiaTheme="minorEastAsia" w:hAnsi="Times New Roman" w:cs="Times New Roman"/>
-          <w:iCs/>
-          <w:sz w:val="28"/>
-          <w:szCs w:val="28"/>
-        </w:rPr>
-        <w:t>ходу','В</w:t>
-      </w:r>
-      <w:proofErr w:type="spellEnd"/>
-      <w:r>
-        <w:rPr>
-          <w:rFonts w:ascii="Times New Roman" w:eastAsiaTheme="minorEastAsia" w:hAnsi="Times New Roman" w:cs="Times New Roman"/>
-          <w:iCs/>
-          <w:sz w:val="28"/>
-          <w:szCs w:val="28"/>
-        </w:rPr>
-        <w:t xml:space="preserve"> швартовом режиме')</w:t>
+      <w:r>
+        <w:rPr>
+          <w:rFonts w:ascii="Times New Roman" w:eastAsiaTheme="minorEastAsia" w:hAnsi="Times New Roman" w:cs="Times New Roman"/>
+          <w:iCs/>
+          <w:sz w:val="28"/>
+          <w:szCs w:val="28"/>
+        </w:rPr>
+        <w:t>legend('На свободном ходу','В швартовом режиме')</w:t>
       </w:r>
     </w:p>
     <w:p>
@@ -12404,7 +11993,6 @@
           <w14:ligatures w14:val="none"/>
         </w:rPr>
       </w:pPr>
-      <w:proofErr w:type="spellStart"/>
       <w:r>
         <w:rPr>
           <w:rFonts w:ascii="Times New Roman" w:eastAsia="Times New Roman" w:hAnsi="Times New Roman" w:cs="Times New Roman"/>
@@ -12413,18 +12001,7 @@
           <w:lang w:val="en-US"/>
           <w14:ligatures w14:val="none"/>
         </w:rPr>
-        <w:t>kv</w:t>
-      </w:r>
-      <w:proofErr w:type="spellEnd"/>
-      <w:r>
-        <w:rPr>
-          <w:rFonts w:ascii="Times New Roman" w:eastAsia="Times New Roman" w:hAnsi="Times New Roman" w:cs="Times New Roman"/>
-          <w:sz w:val="28"/>
-          <w:szCs w:val="28"/>
-          <w:lang w:val="en-US"/>
-          <w14:ligatures w14:val="none"/>
-        </w:rPr>
-        <w:t xml:space="preserve"> = 0.000874; % 0.5*Omega*C/m</w:t>
+        <w:t>kv = 0.000874; % 0.5*Omega*C/m</w:t>
       </w:r>
     </w:p>
     <w:p>
@@ -12440,7 +12017,6 @@
           <w14:ligatures w14:val="none"/>
         </w:rPr>
       </w:pPr>
-      <w:proofErr w:type="spellStart"/>
       <w:r>
         <w:rPr>
           <w:rFonts w:ascii="Times New Roman" w:eastAsia="Times New Roman" w:hAnsi="Times New Roman" w:cs="Times New Roman"/>
@@ -12449,18 +12025,7 @@
           <w:lang w:val="en-US"/>
           <w14:ligatures w14:val="none"/>
         </w:rPr>
-        <w:t>vmax</w:t>
-      </w:r>
-      <w:proofErr w:type="spellEnd"/>
-      <w:r>
-        <w:rPr>
-          <w:rFonts w:ascii="Times New Roman" w:eastAsia="Times New Roman" w:hAnsi="Times New Roman" w:cs="Times New Roman"/>
-          <w:sz w:val="28"/>
-          <w:szCs w:val="28"/>
-          <w:lang w:val="en-US"/>
-          <w14:ligatures w14:val="none"/>
-        </w:rPr>
-        <w:t xml:space="preserve"> = 14*0.514; %m/s</w:t>
+        <w:t>vmax = 14*0.514; %m/s</w:t>
       </w:r>
     </w:p>
     <w:p>
@@ -12484,20 +12049,8 @@
           <w:lang w:val="en-US"/>
           <w14:ligatures w14:val="none"/>
         </w:rPr>
-        <w:t xml:space="preserve">reverse = 1; %enable </w:t>
-      </w:r>
-      <w:proofErr w:type="spellStart"/>
-      <w:r>
-        <w:rPr>
-          <w:rFonts w:ascii="Times New Roman" w:eastAsia="Times New Roman" w:hAnsi="Times New Roman" w:cs="Times New Roman"/>
-          <w:sz w:val="28"/>
-          <w:szCs w:val="28"/>
-          <w:lang w:val="en-US"/>
-          <w14:ligatures w14:val="none"/>
-        </w:rPr>
-        <w:t>reverese</w:t>
-      </w:r>
-      <w:proofErr w:type="spellEnd"/>
+        <w:t>reverse = 1; %enable reverese</w:t>
+      </w:r>
     </w:p>
     <w:p>
       <w:pPr>
@@ -12512,7 +12065,6 @@
           <w14:ligatures w14:val="none"/>
         </w:rPr>
       </w:pPr>
-      <w:proofErr w:type="spellStart"/>
       <w:r>
         <w:rPr>
           <w:rFonts w:ascii="Times New Roman" w:eastAsia="Times New Roman" w:hAnsi="Times New Roman" w:cs="Times New Roman"/>
@@ -12521,40 +12073,7 @@
           <w:lang w:val="en-US"/>
           <w14:ligatures w14:val="none"/>
         </w:rPr>
-        <w:t>kregv</w:t>
-      </w:r>
-      <w:proofErr w:type="spellEnd"/>
-      <w:r>
-        <w:rPr>
-          <w:rFonts w:ascii="Times New Roman" w:eastAsia="Times New Roman" w:hAnsi="Times New Roman" w:cs="Times New Roman"/>
-          <w:sz w:val="28"/>
-          <w:szCs w:val="28"/>
-          <w:lang w:val="en-US"/>
-          <w14:ligatures w14:val="none"/>
-        </w:rPr>
-        <w:t xml:space="preserve"> = 4; % av: </w:t>
-      </w:r>
-      <w:proofErr w:type="spellStart"/>
-      <w:r>
-        <w:rPr>
-          <w:rFonts w:ascii="Times New Roman" w:eastAsia="Times New Roman" w:hAnsi="Times New Roman" w:cs="Times New Roman"/>
-          <w:sz w:val="28"/>
-          <w:szCs w:val="28"/>
-          <w:lang w:val="en-US"/>
-          <w14:ligatures w14:val="none"/>
-        </w:rPr>
-        <w:t>kv</w:t>
-      </w:r>
-      <w:proofErr w:type="spellEnd"/>
-      <w:r>
-        <w:rPr>
-          <w:rFonts w:ascii="Times New Roman" w:eastAsia="Times New Roman" w:hAnsi="Times New Roman" w:cs="Times New Roman"/>
-          <w:sz w:val="28"/>
-          <w:szCs w:val="28"/>
-          <w:lang w:val="en-US"/>
-          <w14:ligatures w14:val="none"/>
-        </w:rPr>
-        <w:t>*(V*-v)</w:t>
+        <w:t>kregv = 4; % av: kv*(V*-v)</w:t>
       </w:r>
     </w:p>
     <w:p>
@@ -12570,7 +12089,6 @@
           <w14:ligatures w14:val="none"/>
         </w:rPr>
       </w:pPr>
-      <w:proofErr w:type="spellStart"/>
       <w:r>
         <w:rPr>
           <w:rFonts w:ascii="Times New Roman" w:eastAsia="Times New Roman" w:hAnsi="Times New Roman" w:cs="Times New Roman"/>
@@ -12579,18 +12097,7 @@
           <w:lang w:val="en-US"/>
           <w14:ligatures w14:val="none"/>
         </w:rPr>
-        <w:t>kregi</w:t>
-      </w:r>
-      <w:proofErr w:type="spellEnd"/>
-      <w:r>
-        <w:rPr>
-          <w:rFonts w:ascii="Times New Roman" w:eastAsia="Times New Roman" w:hAnsi="Times New Roman" w:cs="Times New Roman"/>
-          <w:sz w:val="28"/>
-          <w:szCs w:val="28"/>
-          <w:lang w:val="en-US"/>
-          <w14:ligatures w14:val="none"/>
-        </w:rPr>
-        <w:t xml:space="preserve"> = 0.001*0; % ai</w:t>
+        <w:t>kregi = 0.001*0; % ai</w:t>
       </w:r>
     </w:p>
     <w:p>
@@ -12606,7 +12113,6 @@
           <w14:ligatures w14:val="none"/>
         </w:rPr>
       </w:pPr>
-      <w:proofErr w:type="spellStart"/>
       <w:r>
         <w:rPr>
           <w:rFonts w:ascii="Times New Roman" w:eastAsia="Times New Roman" w:hAnsi="Times New Roman" w:cs="Times New Roman"/>
@@ -12615,18 +12121,7 @@
           <w:lang w:val="en-US"/>
           <w14:ligatures w14:val="none"/>
         </w:rPr>
-        <w:t>distance_nm</w:t>
-      </w:r>
-      <w:proofErr w:type="spellEnd"/>
-      <w:r>
-        <w:rPr>
-          <w:rFonts w:ascii="Times New Roman" w:eastAsia="Times New Roman" w:hAnsi="Times New Roman" w:cs="Times New Roman"/>
-          <w:sz w:val="28"/>
-          <w:szCs w:val="28"/>
-          <w:lang w:val="en-US"/>
-          <w14:ligatures w14:val="none"/>
-        </w:rPr>
-        <w:t xml:space="preserve"> = 5; %mileage</w:t>
+        <w:t>distance_nm = 5; %mileage</w:t>
       </w:r>
     </w:p>
     <w:p>
@@ -12650,29 +12145,7 @@
           <w:lang w:val="en-US"/>
           <w14:ligatures w14:val="none"/>
         </w:rPr>
-        <w:t xml:space="preserve">distance = </w:t>
-      </w:r>
-      <w:proofErr w:type="spellStart"/>
-      <w:r>
-        <w:rPr>
-          <w:rFonts w:ascii="Times New Roman" w:eastAsia="Times New Roman" w:hAnsi="Times New Roman" w:cs="Times New Roman"/>
-          <w:sz w:val="28"/>
-          <w:szCs w:val="28"/>
-          <w:lang w:val="en-US"/>
-          <w14:ligatures w14:val="none"/>
-        </w:rPr>
-        <w:t>distance_nm</w:t>
-      </w:r>
-      <w:proofErr w:type="spellEnd"/>
-      <w:r>
-        <w:rPr>
-          <w:rFonts w:ascii="Times New Roman" w:eastAsia="Times New Roman" w:hAnsi="Times New Roman" w:cs="Times New Roman"/>
-          <w:sz w:val="28"/>
-          <w:szCs w:val="28"/>
-          <w:lang w:val="en-US"/>
-          <w14:ligatures w14:val="none"/>
-        </w:rPr>
-        <w:t>*1852; %m:</w:t>
+        <w:t>distance = distance_nm*1852; %m:</w:t>
       </w:r>
     </w:p>
     <w:p>
@@ -12688,7 +12161,6 @@
           <w14:ligatures w14:val="none"/>
         </w:rPr>
       </w:pPr>
-      <w:proofErr w:type="spellStart"/>
       <w:r>
         <w:rPr>
           <w:rFonts w:ascii="Times New Roman" w:eastAsia="Times New Roman" w:hAnsi="Times New Roman" w:cs="Times New Roman"/>
@@ -12697,18 +12169,7 @@
           <w:lang w:val="en-US"/>
           <w14:ligatures w14:val="none"/>
         </w:rPr>
-        <w:t>vset</w:t>
-      </w:r>
-      <w:proofErr w:type="spellEnd"/>
-      <w:r>
-        <w:rPr>
-          <w:rFonts w:ascii="Times New Roman" w:eastAsia="Times New Roman" w:hAnsi="Times New Roman" w:cs="Times New Roman"/>
-          <w:sz w:val="28"/>
-          <w:szCs w:val="28"/>
-          <w:lang w:val="en-US"/>
-          <w14:ligatures w14:val="none"/>
-        </w:rPr>
-        <w:t xml:space="preserve"> = 12*0.514; %m/s</w:t>
+        <w:t>vset = 12*0.514; %m/s</w:t>
       </w:r>
     </w:p>
     <w:p>
@@ -12724,7 +12185,6 @@
           <w14:ligatures w14:val="none"/>
         </w:rPr>
       </w:pPr>
-      <w:proofErr w:type="spellStart"/>
       <w:r>
         <w:rPr>
           <w:rFonts w:ascii="Times New Roman" w:eastAsia="Times New Roman" w:hAnsi="Times New Roman" w:cs="Times New Roman"/>
@@ -12733,40 +12193,7 @@
           <w:lang w:val="en-US"/>
           <w14:ligatures w14:val="none"/>
         </w:rPr>
-        <w:t>vcur</w:t>
-      </w:r>
-      <w:proofErr w:type="spellEnd"/>
-      <w:r>
-        <w:rPr>
-          <w:rFonts w:ascii="Times New Roman" w:eastAsia="Times New Roman" w:hAnsi="Times New Roman" w:cs="Times New Roman"/>
-          <w:sz w:val="28"/>
-          <w:szCs w:val="28"/>
-          <w:lang w:val="en-US"/>
-          <w14:ligatures w14:val="none"/>
-        </w:rPr>
-        <w:t xml:space="preserve"> = 0*0.514; % current </w:t>
-      </w:r>
-      <w:proofErr w:type="spellStart"/>
-      <w:r>
-        <w:rPr>
-          <w:rFonts w:ascii="Times New Roman" w:eastAsia="Times New Roman" w:hAnsi="Times New Roman" w:cs="Times New Roman"/>
-          <w:sz w:val="28"/>
-          <w:szCs w:val="28"/>
-          <w:lang w:val="en-US"/>
-          <w14:ligatures w14:val="none"/>
-        </w:rPr>
-        <w:t>spd</w:t>
-      </w:r>
-      <w:proofErr w:type="spellEnd"/>
-      <w:r>
-        <w:rPr>
-          <w:rFonts w:ascii="Times New Roman" w:eastAsia="Times New Roman" w:hAnsi="Times New Roman" w:cs="Times New Roman"/>
-          <w:sz w:val="28"/>
-          <w:szCs w:val="28"/>
-          <w:lang w:val="en-US"/>
-          <w14:ligatures w14:val="none"/>
-        </w:rPr>
-        <w:t>, m/s</w:t>
+        <w:t>vcur = 0*0.514; % current spd, m/s</w:t>
       </w:r>
     </w:p>
     <w:p>
@@ -12782,7 +12209,6 @@
           <w14:ligatures w14:val="none"/>
         </w:rPr>
       </w:pPr>
-      <w:proofErr w:type="spellStart"/>
       <w:r>
         <w:rPr>
           <w:rFonts w:ascii="Times New Roman" w:eastAsia="Times New Roman" w:hAnsi="Times New Roman" w:cs="Times New Roman"/>
@@ -12791,40 +12217,7 @@
           <w:lang w:val="en-US"/>
           <w14:ligatures w14:val="none"/>
         </w:rPr>
-        <w:t>vwind</w:t>
-      </w:r>
-      <w:proofErr w:type="spellEnd"/>
-      <w:r>
-        <w:rPr>
-          <w:rFonts w:ascii="Times New Roman" w:eastAsia="Times New Roman" w:hAnsi="Times New Roman" w:cs="Times New Roman"/>
-          <w:sz w:val="28"/>
-          <w:szCs w:val="28"/>
-          <w:lang w:val="en-US"/>
-          <w14:ligatures w14:val="none"/>
-        </w:rPr>
-        <w:t xml:space="preserve"> = 6; % wind </w:t>
-      </w:r>
-      <w:proofErr w:type="spellStart"/>
-      <w:r>
-        <w:rPr>
-          <w:rFonts w:ascii="Times New Roman" w:eastAsia="Times New Roman" w:hAnsi="Times New Roman" w:cs="Times New Roman"/>
-          <w:sz w:val="28"/>
-          <w:szCs w:val="28"/>
-          <w:lang w:val="en-US"/>
-          <w14:ligatures w14:val="none"/>
-        </w:rPr>
-        <w:t>spd</w:t>
-      </w:r>
-      <w:proofErr w:type="spellEnd"/>
-      <w:r>
-        <w:rPr>
-          <w:rFonts w:ascii="Times New Roman" w:eastAsia="Times New Roman" w:hAnsi="Times New Roman" w:cs="Times New Roman"/>
-          <w:sz w:val="28"/>
-          <w:szCs w:val="28"/>
-          <w:lang w:val="en-US"/>
-          <w14:ligatures w14:val="none"/>
-        </w:rPr>
-        <w:t>, m/s</w:t>
+        <w:t>vwind = 6; % wind spd, m/s</w:t>
       </w:r>
     </w:p>
     <w:p>
@@ -12873,7 +12266,6 @@
           <w:szCs w:val="28"/>
         </w:rPr>
       </w:pPr>
-      <w:proofErr w:type="spellStart"/>
       <w:r>
         <w:rPr>
           <w:rFonts w:ascii="Times New Roman" w:eastAsiaTheme="minorEastAsia" w:hAnsi="Times New Roman" w:cs="Times New Roman"/>
@@ -12884,7 +12276,6 @@
         </w:rPr>
         <w:t>stopdistance</w:t>
       </w:r>
-      <w:proofErr w:type="spellEnd"/>
       <w:r>
         <w:rPr>
           <w:rFonts w:ascii="Times New Roman" w:eastAsiaTheme="minorEastAsia" w:hAnsi="Times New Roman" w:cs="Times New Roman"/>
@@ -13504,7 +12895,6 @@
         </w:rPr>
         <w:t xml:space="preserve">Рисунок 5 </w:t>
       </w:r>
-      <w:proofErr w:type="gramStart"/>
       <w:r>
         <w:rPr>
           <w:rFonts w:ascii="Times New Roman" w:eastAsiaTheme="minorEastAsia" w:hAnsi="Times New Roman" w:cs="Times New Roman"/>
@@ -13529,17 +12919,7 @@
           <w:sz w:val="28"/>
           <w:szCs w:val="28"/>
         </w:rPr>
-        <w:t xml:space="preserve"> Результат</w:t>
-      </w:r>
-      <w:proofErr w:type="gramEnd"/>
-      <w:r>
-        <w:rPr>
-          <w:rFonts w:ascii="Times New Roman" w:eastAsiaTheme="minorEastAsia" w:hAnsi="Times New Roman" w:cs="Times New Roman"/>
-          <w:iCs/>
-          <w:sz w:val="28"/>
-          <w:szCs w:val="28"/>
-        </w:rPr>
-        <w:t xml:space="preserve"> моделирования при </w:t>
+        <w:t xml:space="preserve"> Результат моделирования при </w:t>
       </w:r>
       <m:oMath>
         <m:sSub>
@@ -14098,7 +13478,6 @@
                 <w14:ligatures w14:val="none"/>
               </w:rPr>
             </w:pPr>
-            <w:proofErr w:type="spellStart"/>
             <w:r>
               <w:rPr>
                 <w:rFonts w:ascii="Times New Roman" w:eastAsia="Times New Roman" w:hAnsi="Times New Roman" w:cs="Times New Roman"/>
@@ -14124,7 +13503,6 @@
               </w:rPr>
               <w:t>i</w:t>
             </w:r>
-            <w:proofErr w:type="spellEnd"/>
           </w:p>
         </w:tc>
         <w:tc>
@@ -14155,7 +13533,6 @@
                 <w14:ligatures w14:val="none"/>
               </w:rPr>
             </w:pPr>
-            <w:proofErr w:type="spellStart"/>
             <w:r>
               <w:rPr>
                 <w:rFonts w:ascii="Times New Roman" w:eastAsia="Times New Roman" w:hAnsi="Times New Roman" w:cs="Times New Roman"/>
@@ -14181,7 +13558,6 @@
               </w:rPr>
               <w:t>m</w:t>
             </w:r>
-            <w:proofErr w:type="spellEnd"/>
             <w:r>
               <w:rPr>
                 <w:rFonts w:ascii="Times New Roman" w:eastAsia="Times New Roman" w:hAnsi="Times New Roman" w:cs="Times New Roman"/>
@@ -14224,7 +13600,6 @@
                 <w14:ligatures w14:val="none"/>
               </w:rPr>
             </w:pPr>
-            <w:proofErr w:type="spellStart"/>
             <w:r>
               <w:rPr>
                 <w:rFonts w:ascii="Times New Roman" w:eastAsia="Times New Roman" w:hAnsi="Times New Roman" w:cs="Times New Roman"/>
@@ -14250,7 +13625,6 @@
               </w:rPr>
               <w:t>max</w:t>
             </w:r>
-            <w:proofErr w:type="spellEnd"/>
             <w:r>
               <w:rPr>
                 <w:rFonts w:ascii="Times New Roman" w:eastAsia="Times New Roman" w:hAnsi="Times New Roman" w:cs="Times New Roman"/>
@@ -17491,7 +16865,6 @@
         </w:rPr>
         <w:t xml:space="preserve">Рисунок 11 </w:t>
       </w:r>
-      <w:proofErr w:type="gramStart"/>
       <w:r>
         <w:rPr>
           <w:rFonts w:ascii="Times New Roman" w:eastAsiaTheme="minorEastAsia" w:hAnsi="Times New Roman" w:cs="Times New Roman"/>
@@ -17507,17 +16880,7 @@
           <w:sz w:val="28"/>
           <w:szCs w:val="28"/>
         </w:rPr>
-        <w:t xml:space="preserve"> Результат</w:t>
-      </w:r>
-      <w:proofErr w:type="gramEnd"/>
-      <w:r>
-        <w:rPr>
-          <w:rFonts w:ascii="Times New Roman" w:eastAsiaTheme="minorEastAsia" w:hAnsi="Times New Roman" w:cs="Times New Roman"/>
-          <w:iCs/>
-          <w:sz w:val="28"/>
-          <w:szCs w:val="28"/>
-        </w:rPr>
-        <w:t xml:space="preserve"> моделирования </w:t>
+        <w:t xml:space="preserve"> Результат моделирования </w:t>
       </w:r>
       <w:r>
         <w:rPr>
@@ -17900,7 +17263,6 @@
                 <w14:ligatures w14:val="none"/>
               </w:rPr>
             </w:pPr>
-            <w:proofErr w:type="spellStart"/>
             <w:r>
               <w:rPr>
                 <w:rFonts w:ascii="Times New Roman" w:eastAsia="Times New Roman" w:hAnsi="Times New Roman" w:cs="Times New Roman"/>
@@ -17926,7 +17288,6 @@
               </w:rPr>
               <w:t>m</w:t>
             </w:r>
-            <w:proofErr w:type="spellEnd"/>
             <w:r>
               <w:rPr>
                 <w:rFonts w:ascii="Times New Roman" w:eastAsia="Times New Roman" w:hAnsi="Times New Roman" w:cs="Times New Roman"/>
@@ -19355,16 +18716,7 @@
             <w:sz w:val="28"/>
             <w:szCs w:val="28"/>
           </w:rPr>
-          <m:t>5</m:t>
-        </m:r>
-        <m:r>
-          <w:rPr>
-            <w:rFonts w:ascii="Cambria Math" w:hAnsi="Cambria Math" w:cs="Times New Roman"/>
-            <w:color w:val="000000"/>
-            <w:sz w:val="28"/>
-            <w:szCs w:val="28"/>
-          </w:rPr>
-          <m:t>∙</m:t>
+          <m:t>5∙</m:t>
         </m:r>
         <m:f>
           <m:fPr>
@@ -19408,25 +18760,7 @@
             <w:sz w:val="28"/>
             <w:szCs w:val="28"/>
           </w:rPr>
-          <m:t>∙1852≈</m:t>
-        </m:r>
-        <m:r>
-          <w:rPr>
-            <w:rFonts w:ascii="Cambria Math" w:hAnsi="Cambria Math" w:cs="Times New Roman"/>
-            <w:color w:val="000000"/>
-            <w:sz w:val="28"/>
-            <w:szCs w:val="28"/>
-          </w:rPr>
-          <m:t>4630</m:t>
-        </m:r>
-        <m:r>
-          <w:rPr>
-            <w:rFonts w:ascii="Cambria Math" w:hAnsi="Cambria Math" w:cs="Times New Roman"/>
-            <w:color w:val="000000"/>
-            <w:sz w:val="28"/>
-            <w:szCs w:val="28"/>
-          </w:rPr>
-          <m:t xml:space="preserve"> м.</m:t>
+          <m:t>∙1852≈4630 м.</m:t>
         </m:r>
       </m:oMath>
     </w:p>
@@ -21042,7 +20376,6 @@
         </w:rPr>
         <w:t xml:space="preserve">Критерий остановки 815.9 – 807.21 </w:t>
       </w:r>
-      <w:proofErr w:type="gramStart"/>
       <w:r>
         <w:rPr>
           <w:rFonts w:ascii="Times New Roman" w:eastAsiaTheme="minorEastAsia" w:hAnsi="Times New Roman" w:cs="Times New Roman"/>
@@ -21059,7 +20392,6 @@
         </w:rPr>
         <w:t>2</w:t>
       </w:r>
-      <w:proofErr w:type="gramEnd"/>
       <w:r>
         <w:rPr>
           <w:rFonts w:ascii="Times New Roman" w:eastAsia="Times New Roman" w:hAnsi="Times New Roman" w:cs="Times New Roman"/>
@@ -21362,27 +20694,7 @@
                 <w:szCs w:val="28"/>
                 <w:lang w:val="en-US"/>
               </w:rPr>
-              <w:t>[</w:t>
-            </w:r>
-            <w:proofErr w:type="gramStart"/>
-            <w:r>
-              <w:rPr>
-                <w:rFonts w:ascii="Times New Roman" w:eastAsiaTheme="minorEastAsia" w:hAnsi="Times New Roman" w:cs="Times New Roman"/>
-                <w:sz w:val="28"/>
-                <w:szCs w:val="28"/>
-                <w:lang w:val="en-US"/>
-              </w:rPr>
-              <w:t>0 ;</w:t>
-            </w:r>
-            <w:proofErr w:type="gramEnd"/>
-            <w:r>
-              <w:rPr>
-                <w:rFonts w:ascii="Times New Roman" w:eastAsiaTheme="minorEastAsia" w:hAnsi="Times New Roman" w:cs="Times New Roman"/>
-                <w:sz w:val="28"/>
-                <w:szCs w:val="28"/>
-                <w:lang w:val="en-US"/>
-              </w:rPr>
-              <w:t xml:space="preserve"> </w:t>
+              <w:t xml:space="preserve">[0 ; </w:t>
             </w:r>
             <w:r>
               <w:rPr>
@@ -21459,44 +20771,24 @@
                 <w:szCs w:val="28"/>
                 <w:lang w:val="en-US"/>
               </w:rPr>
-              <w:t>[</w:t>
-            </w:r>
-            <w:proofErr w:type="gramStart"/>
+              <w:t>[0</w:t>
+            </w:r>
             <w:r>
               <w:rPr>
                 <w:rFonts w:ascii="Times New Roman" w:eastAsiaTheme="minorEastAsia" w:hAnsi="Times New Roman" w:cs="Times New Roman"/>
                 <w:sz w:val="28"/>
                 <w:szCs w:val="28"/>
+              </w:rPr>
+              <w:t xml:space="preserve"> </w:t>
+            </w:r>
+            <w:r>
+              <w:rPr>
+                <w:rFonts w:ascii="Times New Roman" w:eastAsiaTheme="minorEastAsia" w:hAnsi="Times New Roman" w:cs="Times New Roman"/>
+                <w:sz w:val="28"/>
+                <w:szCs w:val="28"/>
                 <w:lang w:val="en-US"/>
               </w:rPr>
-              <w:t>0</w:t>
-            </w:r>
-            <w:r>
-              <w:rPr>
-                <w:rFonts w:ascii="Times New Roman" w:eastAsiaTheme="minorEastAsia" w:hAnsi="Times New Roman" w:cs="Times New Roman"/>
-                <w:sz w:val="28"/>
-                <w:szCs w:val="28"/>
-              </w:rPr>
-              <w:t xml:space="preserve"> </w:t>
-            </w:r>
-            <w:r>
-              <w:rPr>
-                <w:rFonts w:ascii="Times New Roman" w:eastAsiaTheme="minorEastAsia" w:hAnsi="Times New Roman" w:cs="Times New Roman"/>
-                <w:sz w:val="28"/>
-                <w:szCs w:val="28"/>
-                <w:lang w:val="en-US"/>
-              </w:rPr>
-              <w:t>;</w:t>
-            </w:r>
-            <w:proofErr w:type="gramEnd"/>
-            <w:r>
-              <w:rPr>
-                <w:rFonts w:ascii="Times New Roman" w:eastAsiaTheme="minorEastAsia" w:hAnsi="Times New Roman" w:cs="Times New Roman"/>
-                <w:sz w:val="28"/>
-                <w:szCs w:val="28"/>
-                <w:lang w:val="en-US"/>
-              </w:rPr>
-              <w:t xml:space="preserve"> 1111]</w:t>
+              <w:t>; 1111]</w:t>
             </w:r>
           </w:p>
         </w:tc>
@@ -21554,19 +20846,8 @@
                 <w:szCs w:val="28"/>
                 <w:lang w:val="en-US"/>
               </w:rPr>
-              <w:t>[</w:t>
-            </w:r>
-            <w:proofErr w:type="gramStart"/>
-            <w:r>
-              <w:rPr>
-                <w:rFonts w:ascii="Times New Roman" w:eastAsiaTheme="minorEastAsia" w:hAnsi="Times New Roman" w:cs="Times New Roman"/>
-                <w:sz w:val="28"/>
-                <w:szCs w:val="28"/>
-                <w:lang w:val="en-US"/>
-              </w:rPr>
-              <w:t>555.5 ;</w:t>
-            </w:r>
-            <w:proofErr w:type="gramEnd"/>
+              <w:t>[555.5 ;</w:t>
+            </w:r>
             <w:r>
               <w:rPr>
                 <w:rFonts w:ascii="Times New Roman" w:eastAsiaTheme="minorEastAsia" w:hAnsi="Times New Roman" w:cs="Times New Roman"/>
@@ -21650,27 +20931,7 @@
                 <w:szCs w:val="28"/>
                 <w:lang w:val="en-US"/>
               </w:rPr>
-              <w:t>[</w:t>
-            </w:r>
-            <w:proofErr w:type="gramStart"/>
-            <w:r>
-              <w:rPr>
-                <w:rFonts w:ascii="Times New Roman" w:eastAsiaTheme="minorEastAsia" w:hAnsi="Times New Roman" w:cs="Times New Roman"/>
-                <w:sz w:val="28"/>
-                <w:szCs w:val="28"/>
-                <w:lang w:val="en-US"/>
-              </w:rPr>
-              <w:t>555.5 ;</w:t>
-            </w:r>
-            <w:proofErr w:type="gramEnd"/>
-            <w:r>
-              <w:rPr>
-                <w:rFonts w:ascii="Times New Roman" w:eastAsiaTheme="minorEastAsia" w:hAnsi="Times New Roman" w:cs="Times New Roman"/>
-                <w:sz w:val="28"/>
-                <w:szCs w:val="28"/>
-                <w:lang w:val="en-US"/>
-              </w:rPr>
-              <w:t xml:space="preserve"> </w:t>
+              <w:t xml:space="preserve">[555.5 ; </w:t>
             </w:r>
             <w:r>
               <w:rPr>
@@ -21756,7 +21017,6 @@
               </w:rPr>
               <w:t>[</w:t>
             </w:r>
-            <w:proofErr w:type="gramStart"/>
             <w:r>
               <w:rPr>
                 <w:rFonts w:ascii="Times New Roman" w:hAnsi="Times New Roman" w:cs="Times New Roman"/>
@@ -21789,17 +21049,7 @@
                 <w:szCs w:val="28"/>
                 <w:lang w:val="en-US"/>
               </w:rPr>
-              <w:t>;</w:t>
-            </w:r>
-            <w:proofErr w:type="gramEnd"/>
-            <w:r>
-              <w:rPr>
-                <w:rFonts w:ascii="Times New Roman" w:eastAsiaTheme="minorEastAsia" w:hAnsi="Times New Roman" w:cs="Times New Roman"/>
-                <w:sz w:val="28"/>
-                <w:szCs w:val="28"/>
-                <w:lang w:val="en-US"/>
-              </w:rPr>
-              <w:t xml:space="preserve"> </w:t>
+              <w:t xml:space="preserve">; </w:t>
             </w:r>
             <w:r>
               <w:rPr>
@@ -21883,44 +21133,24 @@
                 <w:szCs w:val="28"/>
                 <w:lang w:val="en-US"/>
               </w:rPr>
-              <w:t>[</w:t>
-            </w:r>
-            <w:proofErr w:type="gramStart"/>
+              <w:t>[763.8</w:t>
+            </w:r>
             <w:r>
               <w:rPr>
                 <w:rFonts w:ascii="Times New Roman" w:eastAsiaTheme="minorEastAsia" w:hAnsi="Times New Roman" w:cs="Times New Roman"/>
                 <w:sz w:val="28"/>
                 <w:szCs w:val="28"/>
+              </w:rPr>
+              <w:t xml:space="preserve"> </w:t>
+            </w:r>
+            <w:r>
+              <w:rPr>
+                <w:rFonts w:ascii="Times New Roman" w:eastAsiaTheme="minorEastAsia" w:hAnsi="Times New Roman" w:cs="Times New Roman"/>
+                <w:sz w:val="28"/>
+                <w:szCs w:val="28"/>
                 <w:lang w:val="en-US"/>
               </w:rPr>
-              <w:t>763.8</w:t>
-            </w:r>
-            <w:r>
-              <w:rPr>
-                <w:rFonts w:ascii="Times New Roman" w:eastAsiaTheme="minorEastAsia" w:hAnsi="Times New Roman" w:cs="Times New Roman"/>
-                <w:sz w:val="28"/>
-                <w:szCs w:val="28"/>
-              </w:rPr>
-              <w:t xml:space="preserve"> </w:t>
-            </w:r>
-            <w:r>
-              <w:rPr>
-                <w:rFonts w:ascii="Times New Roman" w:eastAsiaTheme="minorEastAsia" w:hAnsi="Times New Roman" w:cs="Times New Roman"/>
-                <w:sz w:val="28"/>
-                <w:szCs w:val="28"/>
-                <w:lang w:val="en-US"/>
-              </w:rPr>
-              <w:t>;</w:t>
-            </w:r>
-            <w:proofErr w:type="gramEnd"/>
-            <w:r>
-              <w:rPr>
-                <w:rFonts w:ascii="Times New Roman" w:eastAsiaTheme="minorEastAsia" w:hAnsi="Times New Roman" w:cs="Times New Roman"/>
-                <w:sz w:val="28"/>
-                <w:szCs w:val="28"/>
-                <w:lang w:val="en-US"/>
-              </w:rPr>
-              <w:t xml:space="preserve"> </w:t>
+              <w:t xml:space="preserve">; </w:t>
             </w:r>
             <w:r>
               <w:rPr>
@@ -22006,7 +21236,6 @@
               </w:rPr>
               <w:t>[</w:t>
             </w:r>
-            <w:proofErr w:type="gramStart"/>
             <w:r>
               <w:rPr>
                 <w:rFonts w:ascii="Times New Roman" w:hAnsi="Times New Roman" w:cs="Times New Roman"/>
@@ -22031,17 +21260,7 @@
                 <w:szCs w:val="28"/>
                 <w:lang w:val="en-US"/>
               </w:rPr>
-              <w:t>;</w:t>
-            </w:r>
-            <w:proofErr w:type="gramEnd"/>
-            <w:r>
-              <w:rPr>
-                <w:rFonts w:ascii="Times New Roman" w:eastAsiaTheme="minorEastAsia" w:hAnsi="Times New Roman" w:cs="Times New Roman"/>
-                <w:sz w:val="28"/>
-                <w:szCs w:val="28"/>
-                <w:lang w:val="en-US"/>
-              </w:rPr>
-              <w:t xml:space="preserve"> </w:t>
+              <w:t xml:space="preserve">; </w:t>
             </w:r>
             <w:r>
               <w:rPr>
@@ -22127,7 +21346,6 @@
               </w:rPr>
               <w:t>[</w:t>
             </w:r>
-            <w:proofErr w:type="gramStart"/>
             <w:r>
               <w:rPr>
                 <w:rFonts w:ascii="Times New Roman" w:hAnsi="Times New Roman" w:cs="Times New Roman"/>
@@ -22152,17 +21370,7 @@
                 <w:szCs w:val="28"/>
                 <w:lang w:val="en-US"/>
               </w:rPr>
-              <w:t>;</w:t>
-            </w:r>
-            <w:proofErr w:type="gramEnd"/>
-            <w:r>
-              <w:rPr>
-                <w:rFonts w:ascii="Times New Roman" w:eastAsiaTheme="minorEastAsia" w:hAnsi="Times New Roman" w:cs="Times New Roman"/>
-                <w:sz w:val="28"/>
-                <w:szCs w:val="28"/>
-                <w:lang w:val="en-US"/>
-              </w:rPr>
-              <w:t xml:space="preserve"> </w:t>
+              <w:t xml:space="preserve">; </w:t>
             </w:r>
             <m:oMath>
               <m:r>
@@ -22245,7 +21453,6 @@
               </w:rPr>
               <w:t>[</w:t>
             </w:r>
-            <w:proofErr w:type="gramStart"/>
             <w:r>
               <w:rPr>
                 <w:rFonts w:ascii="Times New Roman" w:eastAsiaTheme="minorEastAsia" w:hAnsi="Times New Roman" w:cs="Times New Roman"/>
@@ -22269,17 +21476,7 @@
                 <w:szCs w:val="28"/>
                 <w:lang w:val="en-US"/>
               </w:rPr>
-              <w:t>;</w:t>
-            </w:r>
-            <w:proofErr w:type="gramEnd"/>
-            <w:r>
-              <w:rPr>
-                <w:rFonts w:ascii="Times New Roman" w:eastAsiaTheme="minorEastAsia" w:hAnsi="Times New Roman" w:cs="Times New Roman"/>
-                <w:sz w:val="28"/>
-                <w:szCs w:val="28"/>
-                <w:lang w:val="en-US"/>
-              </w:rPr>
-              <w:t xml:space="preserve"> </w:t>
+              <w:t xml:space="preserve">; </w:t>
             </w:r>
             <m:oMath>
               <m:r>
@@ -22978,23 +22175,13 @@
         </w:rPr>
         <w:t xml:space="preserve"> </w:t>
       </w:r>
-      <w:proofErr w:type="gramStart"/>
       <w:r>
         <w:rPr>
           <w:rFonts w:ascii="Times New Roman" w:hAnsi="Times New Roman" w:cs="Times New Roman"/>
           <w:sz w:val="28"/>
           <w:szCs w:val="28"/>
         </w:rPr>
-        <w:t>с  шагом</w:t>
-      </w:r>
-      <w:proofErr w:type="gramEnd"/>
-      <w:r>
-        <w:rPr>
-          <w:rFonts w:ascii="Times New Roman" w:hAnsi="Times New Roman" w:cs="Times New Roman"/>
-          <w:sz w:val="28"/>
-          <w:szCs w:val="28"/>
-        </w:rPr>
-        <w:t xml:space="preserve"> 5 м</w:t>
+        <w:t>с  шагом 5 м</w:t>
       </w:r>
       <w:r>
         <w:rPr>
@@ -25820,25 +25007,7 @@
           <w:sz w:val="28"/>
           <w:szCs w:val="28"/>
         </w:rPr>
-        <w:t xml:space="preserve">Однако в этом случае конечная скорость незначительно превышает, максимальную скорость в конце. </w:t>
-      </w:r>
-      <w:proofErr w:type="gramStart"/>
-      <w:r>
-        <w:rPr>
-          <w:rFonts w:ascii="Times New Roman" w:eastAsia="Times New Roman" w:hAnsi="Times New Roman" w:cs="Times New Roman"/>
-          <w:sz w:val="28"/>
-          <w:szCs w:val="28"/>
-        </w:rPr>
-        <w:t>Результат</w:t>
-      </w:r>
-      <w:proofErr w:type="gramEnd"/>
-      <w:r>
-        <w:rPr>
-          <w:rFonts w:ascii="Times New Roman" w:eastAsia="Times New Roman" w:hAnsi="Times New Roman" w:cs="Times New Roman"/>
-          <w:sz w:val="28"/>
-          <w:szCs w:val="28"/>
-        </w:rPr>
-        <w:t xml:space="preserve"> при котором этого не происходит</w:t>
+        <w:t>Однако в этом случае конечная скорость незначительно превышает, максимальную скорость в конце. Результат при котором этого не происходит</w:t>
       </w:r>
       <w:r>
         <w:rPr>
@@ -26046,51 +25215,7 @@
           <w:sz w:val="28"/>
           <w:szCs w:val="28"/>
         </w:rPr>
-        <w:t>Выполним определение оптимальных параметров методом многомерной оптимизации (</w:t>
-      </w:r>
-      <w:proofErr w:type="spellStart"/>
-      <w:r>
-        <w:rPr>
-          <w:rFonts w:ascii="Times New Roman" w:eastAsia="Cambria" w:hAnsi="Times New Roman" w:cs="Times New Roman"/>
-          <w:b/>
-          <w:color w:val="000000"/>
-          <w:sz w:val="28"/>
-          <w:szCs w:val="28"/>
-        </w:rPr>
-        <w:t>fminsearch</w:t>
-      </w:r>
-      <w:proofErr w:type="spellEnd"/>
-      <w:r>
-        <w:rPr>
-          <w:rFonts w:ascii="Times New Roman" w:eastAsia="Cambria" w:hAnsi="Times New Roman" w:cs="Times New Roman"/>
-          <w:b/>
-          <w:color w:val="000000"/>
-          <w:sz w:val="28"/>
-          <w:szCs w:val="28"/>
-        </w:rPr>
-        <w:t xml:space="preserve">, метод </w:t>
-      </w:r>
-      <w:proofErr w:type="spellStart"/>
-      <w:r>
-        <w:rPr>
-          <w:rFonts w:ascii="Times New Roman" w:eastAsia="Cambria" w:hAnsi="Times New Roman" w:cs="Times New Roman"/>
-          <w:b/>
-          <w:color w:val="000000"/>
-          <w:sz w:val="28"/>
-          <w:szCs w:val="28"/>
-        </w:rPr>
-        <w:t>Нелдера</w:t>
-      </w:r>
-      <w:proofErr w:type="spellEnd"/>
-      <w:r>
-        <w:rPr>
-          <w:rFonts w:ascii="Times New Roman" w:eastAsia="Cambria" w:hAnsi="Times New Roman" w:cs="Times New Roman"/>
-          <w:b/>
-          <w:color w:val="000000"/>
-          <w:sz w:val="28"/>
-          <w:szCs w:val="28"/>
-        </w:rPr>
-        <w:t xml:space="preserve">–Мида) </w:t>
+        <w:t xml:space="preserve">Выполним определение оптимальных параметров методом многомерной оптимизации (fminsearch, метод Нелдера–Мида) </w:t>
       </w:r>
     </w:p>
     <w:p>
@@ -26119,27 +25244,7 @@
           <w:sz w:val="28"/>
           <w:szCs w:val="28"/>
         </w:rPr>
-        <w:t xml:space="preserve">Выставим в программе </w:t>
-      </w:r>
-      <w:proofErr w:type="spellStart"/>
-      <w:r>
-        <w:rPr>
-          <w:rFonts w:ascii="Times New Roman" w:eastAsia="Cambria" w:hAnsi="Times New Roman" w:cs="Times New Roman"/>
-          <w:color w:val="000000"/>
-          <w:sz w:val="28"/>
-          <w:szCs w:val="28"/>
-        </w:rPr>
-        <w:t>needOpt</w:t>
-      </w:r>
-      <w:proofErr w:type="spellEnd"/>
-      <w:r>
-        <w:rPr>
-          <w:rFonts w:ascii="Times New Roman" w:eastAsia="Cambria" w:hAnsi="Times New Roman" w:cs="Times New Roman"/>
-          <w:color w:val="000000"/>
-          <w:sz w:val="28"/>
-          <w:szCs w:val="28"/>
-        </w:rPr>
-        <w:t xml:space="preserve"> = 1. Определим </w:t>
+        <w:t xml:space="preserve">Выставим в программе needOpt = 1. Определим </w:t>
       </w:r>
       <m:oMath>
         <m:sSub>
@@ -34742,25 +33847,7 @@
           <w:sz w:val="28"/>
           <w:szCs w:val="28"/>
         </w:rPr>
-        <w:t xml:space="preserve">, является одним </w:t>
-      </w:r>
-      <w:proofErr w:type="gramStart"/>
-      <w:r>
-        <w:rPr>
-          <w:rFonts w:ascii="Times New Roman" w:hAnsi="Times New Roman" w:cs="Times New Roman"/>
-          <w:sz w:val="28"/>
-          <w:szCs w:val="28"/>
-        </w:rPr>
-        <w:t>из  лучших</w:t>
-      </w:r>
-      <w:proofErr w:type="gramEnd"/>
-      <w:r>
-        <w:rPr>
-          <w:rFonts w:ascii="Times New Roman" w:hAnsi="Times New Roman" w:cs="Times New Roman"/>
-          <w:sz w:val="28"/>
-          <w:szCs w:val="28"/>
-        </w:rPr>
-        <w:t xml:space="preserve"> результатом. Оставим этот коэффициент неизменным.</w:t>
+        <w:t>, является одним из  лучших результатом. Оставим этот коэффициент неизменным.</w:t>
       </w:r>
     </w:p>
     <w:p>
@@ -35095,23 +34182,13 @@
         </w:rPr>
         <w:t xml:space="preserve"> </w:t>
       </w:r>
-      <w:proofErr w:type="gramStart"/>
       <w:r>
         <w:rPr>
           <w:rFonts w:ascii="Times New Roman" w:eastAsia="Cambria" w:hAnsi="Times New Roman" w:cs="Times New Roman"/>
           <w:sz w:val="28"/>
           <w:szCs w:val="28"/>
         </w:rPr>
-        <w:t>Результат</w:t>
-      </w:r>
-      <w:proofErr w:type="gramEnd"/>
-      <w:r>
-        <w:rPr>
-          <w:rFonts w:ascii="Times New Roman" w:eastAsia="Cambria" w:hAnsi="Times New Roman" w:cs="Times New Roman"/>
-          <w:sz w:val="28"/>
-          <w:szCs w:val="28"/>
-        </w:rPr>
-        <w:t xml:space="preserve"> полученный при встречном течение представлен на рисунке 16.</w:t>
+        <w:t>Результат полученный при встречном течение представлен на рисунке 16.</w:t>
       </w:r>
     </w:p>
     <w:p>
@@ -37305,25 +36382,7 @@
           <w:sz w:val="28"/>
           <w:szCs w:val="28"/>
         </w:rPr>
-        <w:t xml:space="preserve">а </w:t>
-      </w:r>
-      <w:proofErr w:type="gramStart"/>
-      <w:r>
-        <w:rPr>
-          <w:rFonts w:ascii="Times New Roman" w:eastAsia="Cambria" w:hAnsi="Times New Roman" w:cs="Times New Roman"/>
-          <w:sz w:val="28"/>
-          <w:szCs w:val="28"/>
-        </w:rPr>
-        <w:t>так же</w:t>
-      </w:r>
-      <w:proofErr w:type="gramEnd"/>
-      <w:r>
-        <w:rPr>
-          <w:rFonts w:ascii="Times New Roman" w:eastAsia="Cambria" w:hAnsi="Times New Roman" w:cs="Times New Roman"/>
-          <w:sz w:val="28"/>
-          <w:szCs w:val="28"/>
-        </w:rPr>
-        <w:t xml:space="preserve"> сравнение</w:t>
+        <w:t>а так же сравнение</w:t>
       </w:r>
       <w:r>
         <w:rPr>
@@ -37409,25 +36468,7 @@
           <w:sz w:val="28"/>
           <w:szCs w:val="28"/>
         </w:rPr>
-        <w:t xml:space="preserve"> можно сделать вывод, </w:t>
-      </w:r>
-      <w:proofErr w:type="gramStart"/>
-      <w:r>
-        <w:rPr>
-          <w:rFonts w:ascii="Times New Roman" w:eastAsia="Cambria" w:hAnsi="Times New Roman" w:cs="Times New Roman"/>
-          <w:sz w:val="28"/>
-          <w:szCs w:val="28"/>
-        </w:rPr>
-        <w:t>что</w:t>
-      </w:r>
-      <w:proofErr w:type="gramEnd"/>
-      <w:r>
-        <w:rPr>
-          <w:rFonts w:ascii="Times New Roman" w:eastAsia="Cambria" w:hAnsi="Times New Roman" w:cs="Times New Roman"/>
-          <w:sz w:val="28"/>
-          <w:szCs w:val="28"/>
-        </w:rPr>
-        <w:t xml:space="preserve"> если слишком сильно увеличить параметр, судно перестает доезжать до конечно точки.</w:t>
+        <w:t xml:space="preserve"> можно сделать вывод, что если слишком сильно увеличить параметр, судно перестает доезжать до конечно точки.</w:t>
       </w:r>
     </w:p>
     <w:p>
@@ -38122,43 +37163,7 @@
           <w:sz w:val="28"/>
           <w:szCs w:val="28"/>
         </w:rPr>
-        <w:t xml:space="preserve"> </w:t>
-      </w:r>
-      <w:proofErr w:type="spellStart"/>
-      <w:r>
-        <w:rPr>
-          <w:rFonts w:ascii="Times New Roman" w:eastAsia="Cambria" w:hAnsi="Times New Roman" w:cs="Times New Roman"/>
-          <w:sz w:val="28"/>
-          <w:szCs w:val="28"/>
-        </w:rPr>
-        <w:t>Амбросовская</w:t>
-      </w:r>
-      <w:proofErr w:type="spellEnd"/>
-      <w:r>
-        <w:rPr>
-          <w:rFonts w:ascii="Times New Roman" w:eastAsia="Cambria" w:hAnsi="Times New Roman" w:cs="Times New Roman"/>
-          <w:sz w:val="28"/>
-          <w:szCs w:val="28"/>
-        </w:rPr>
-        <w:t xml:space="preserve"> Е. Б., Кац Б. А.  Введение в оптимизацию и оптимальное управление: учеб. пособие. СПб.: Изд-во </w:t>
-      </w:r>
-      <w:proofErr w:type="spellStart"/>
-      <w:r>
-        <w:rPr>
-          <w:rFonts w:ascii="Times New Roman" w:eastAsia="Cambria" w:hAnsi="Times New Roman" w:cs="Times New Roman"/>
-          <w:sz w:val="28"/>
-          <w:szCs w:val="28"/>
-        </w:rPr>
-        <w:t>СПбГЭТУ</w:t>
-      </w:r>
-      <w:proofErr w:type="spellEnd"/>
-      <w:r>
-        <w:rPr>
-          <w:rFonts w:ascii="Times New Roman" w:eastAsia="Cambria" w:hAnsi="Times New Roman" w:cs="Times New Roman"/>
-          <w:sz w:val="28"/>
-          <w:szCs w:val="28"/>
-        </w:rPr>
-        <w:t xml:space="preserve"> «ЛЭТИ», 2021.  </w:t>
+        <w:t xml:space="preserve"> Амбросовская Е. Б., Кац Б. А.  Введение в оптимизацию и оптимальное управление: учеб. пособие. СПб.: Изд-во СПбГЭТУ «ЛЭТИ», 2021.  </w:t>
       </w:r>
     </w:p>
     <w:p>
@@ -38187,61 +37192,7 @@
           <w:sz w:val="28"/>
           <w:szCs w:val="28"/>
         </w:rPr>
-        <w:t xml:space="preserve"> </w:t>
-      </w:r>
-      <w:proofErr w:type="spellStart"/>
-      <w:r>
-        <w:rPr>
-          <w:rFonts w:ascii="Times New Roman" w:eastAsia="Cambria" w:hAnsi="Times New Roman" w:cs="Times New Roman"/>
-          <w:sz w:val="28"/>
-          <w:szCs w:val="28"/>
-        </w:rPr>
-        <w:t>Амбросовский</w:t>
-      </w:r>
-      <w:proofErr w:type="spellEnd"/>
-      <w:r>
-        <w:rPr>
-          <w:rFonts w:ascii="Times New Roman" w:eastAsia="Cambria" w:hAnsi="Times New Roman" w:cs="Times New Roman"/>
-          <w:sz w:val="28"/>
-          <w:szCs w:val="28"/>
-        </w:rPr>
-        <w:t xml:space="preserve"> В. М., </w:t>
-      </w:r>
-      <w:proofErr w:type="spellStart"/>
-      <w:r>
-        <w:rPr>
-          <w:rFonts w:ascii="Times New Roman" w:eastAsia="Cambria" w:hAnsi="Times New Roman" w:cs="Times New Roman"/>
-          <w:sz w:val="28"/>
-          <w:szCs w:val="28"/>
-        </w:rPr>
-        <w:t>Амбросовская</w:t>
-      </w:r>
-      <w:proofErr w:type="spellEnd"/>
-      <w:r>
-        <w:rPr>
-          <w:rFonts w:ascii="Times New Roman" w:eastAsia="Cambria" w:hAnsi="Times New Roman" w:cs="Times New Roman"/>
-          <w:sz w:val="28"/>
-          <w:szCs w:val="28"/>
-        </w:rPr>
-        <w:t xml:space="preserve"> Е. Б. Устройство и технические средства корабля: учеб. пособие. СПб.: Изд-во </w:t>
-      </w:r>
-      <w:proofErr w:type="spellStart"/>
-      <w:r>
-        <w:rPr>
-          <w:rFonts w:ascii="Times New Roman" w:eastAsia="Cambria" w:hAnsi="Times New Roman" w:cs="Times New Roman"/>
-          <w:sz w:val="28"/>
-          <w:szCs w:val="28"/>
-        </w:rPr>
-        <w:t>СПбГЭТУ</w:t>
-      </w:r>
-      <w:proofErr w:type="spellEnd"/>
-      <w:r>
-        <w:rPr>
-          <w:rFonts w:ascii="Times New Roman" w:eastAsia="Cambria" w:hAnsi="Times New Roman" w:cs="Times New Roman"/>
-          <w:sz w:val="28"/>
-          <w:szCs w:val="28"/>
-        </w:rPr>
-        <w:t xml:space="preserve"> «ЛЭТИ», 2020.  </w:t>
+        <w:t xml:space="preserve"> Амбросовский В. М., Амбросовская Е. Б. Устройство и технические средства корабля: учеб. пособие. СПб.: Изд-во СПбГЭТУ «ЛЭТИ», 2020.  </w:t>
       </w:r>
     </w:p>
     <w:p>

</xml_diff>